<commit_message>
Recorrido en Chrome: capturas, videos y documentación con imágenes
- docs/capturas/: 52 capturas de pantalla del recorrido por las 5 escenas del guion
- docs/videos/: GIF por escena y recorrido_completo.mp4 (docs/generar_videos.py)
- Manual de usuario con capturas y notas del formulario de producto (código, precio, EAN)
- Word/PDF regenerados con imágenes (32 páginas)
- Ajustes detectados en el recorrido: fila de producto inactivo legible, botón Nuevo
  Producto solo para Supervisor, comentario del movimiento conservado al reenviar,
  columna Déficit calculada en la vista y sin botón Reabastecer, populate_data asigna
  cada producto a la clase de su prefijo

Co-Authored-By: Claude Fable 5.1 <noreply@anthropic.com>
</commit_message>
<xml_diff>
--- a/docs/Documentacion_Sistema_Inventarios_Manaudi.docx
+++ b/docs/Documentacion_Sistema_Inventarios_Manaudi.docx
@@ -77,7 +77,7 @@
           <w:color w:val="595959"/>
           <w:sz w:val="22"/>
         </w:rPr>
-        <w:t>Versión 1.0 · 24/10/2026</w:t>
+        <w:t>Versión 1.0 · 25/10/2026</w:t>
       </w:r>
     </w:p>
     <w:p>
@@ -113,7 +113,7 @@
       <w:pPr>
         <w:pStyle w:val="Ttulo1"/>
       </w:pPr>
-      <w:bookmarkStart w:id="0" w:name="_Toc243776922"/>
+      <w:bookmarkStart w:id="0" w:name="_Toc243779753"/>
       <w:r>
         <w:t>Contenido</w:t>
       </w:r>
@@ -144,7 +144,7 @@
       <w:r>
         <w:fldChar w:fldCharType="separate"/>
       </w:r>
-      <w:hyperlink w:anchor="_Toc243776922" w:history="1">
+      <w:hyperlink w:anchor="_Toc243779753" w:history="1">
         <w:r>
           <w:rPr>
             <w:rStyle w:val="Hipervnculo"/>
@@ -171,7 +171,7 @@
             <w:noProof/>
             <w:webHidden/>
           </w:rPr>
-          <w:instrText xml:space="preserve"> PAGEREF _Toc243776922 \h </w:instrText>
+          <w:instrText xml:space="preserve"> PAGEREF _Toc243779753 \h </w:instrText>
         </w:r>
         <w:r>
           <w:rPr>
@@ -218,7 +218,7 @@
           <w14:ligatures w14:val="standardContextual"/>
         </w:rPr>
       </w:pPr>
-      <w:hyperlink w:anchor="_Toc243776923" w:history="1">
+      <w:hyperlink w:anchor="_Toc243779754" w:history="1">
         <w:r>
           <w:rPr>
             <w:rStyle w:val="Hipervnculo"/>
@@ -245,7 +245,7 @@
             <w:noProof/>
             <w:webHidden/>
           </w:rPr>
-          <w:instrText xml:space="preserve"> PAGEREF _Toc243776923 \h </w:instrText>
+          <w:instrText xml:space="preserve"> PAGEREF _Toc243779754 \h </w:instrText>
         </w:r>
         <w:r>
           <w:rPr>
@@ -292,7 +292,7 @@
           <w14:ligatures w14:val="standardContextual"/>
         </w:rPr>
       </w:pPr>
-      <w:hyperlink w:anchor="_Toc243776924" w:history="1">
+      <w:hyperlink w:anchor="_Toc243779755" w:history="1">
         <w:r>
           <w:rPr>
             <w:rStyle w:val="Hipervnculo"/>
@@ -319,7 +319,7 @@
             <w:noProof/>
             <w:webHidden/>
           </w:rPr>
-          <w:instrText xml:space="preserve"> PAGEREF _Toc243776924 \h </w:instrText>
+          <w:instrText xml:space="preserve"> PAGEREF _Toc243779755 \h </w:instrText>
         </w:r>
         <w:r>
           <w:rPr>
@@ -366,7 +366,7 @@
           <w14:ligatures w14:val="standardContextual"/>
         </w:rPr>
       </w:pPr>
-      <w:hyperlink w:anchor="_Toc243776925" w:history="1">
+      <w:hyperlink w:anchor="_Toc243779756" w:history="1">
         <w:r>
           <w:rPr>
             <w:rStyle w:val="Hipervnculo"/>
@@ -393,7 +393,7 @@
             <w:noProof/>
             <w:webHidden/>
           </w:rPr>
-          <w:instrText xml:space="preserve"> PAGEREF _Toc243776925 \h </w:instrText>
+          <w:instrText xml:space="preserve"> PAGEREF _Toc243779756 \h </w:instrText>
         </w:r>
         <w:r>
           <w:rPr>
@@ -440,7 +440,7 @@
           <w14:ligatures w14:val="standardContextual"/>
         </w:rPr>
       </w:pPr>
-      <w:hyperlink w:anchor="_Toc243776926" w:history="1">
+      <w:hyperlink w:anchor="_Toc243779757" w:history="1">
         <w:r>
           <w:rPr>
             <w:rStyle w:val="Hipervnculo"/>
@@ -467,7 +467,7 @@
             <w:noProof/>
             <w:webHidden/>
           </w:rPr>
-          <w:instrText xml:space="preserve"> PAGEREF _Toc243776926 \h </w:instrText>
+          <w:instrText xml:space="preserve"> PAGEREF _Toc243779757 \h </w:instrText>
         </w:r>
         <w:r>
           <w:rPr>
@@ -514,7 +514,7 @@
           <w14:ligatures w14:val="standardContextual"/>
         </w:rPr>
       </w:pPr>
-      <w:hyperlink w:anchor="_Toc243776927" w:history="1">
+      <w:hyperlink w:anchor="_Toc243779758" w:history="1">
         <w:r>
           <w:rPr>
             <w:rStyle w:val="Hipervnculo"/>
@@ -541,7 +541,7 @@
             <w:noProof/>
             <w:webHidden/>
           </w:rPr>
-          <w:instrText xml:space="preserve"> PAGEREF _Toc243776927 \h </w:instrText>
+          <w:instrText xml:space="preserve"> PAGEREF _Toc243779758 \h </w:instrText>
         </w:r>
         <w:r>
           <w:rPr>
@@ -588,7 +588,7 @@
           <w14:ligatures w14:val="standardContextual"/>
         </w:rPr>
       </w:pPr>
-      <w:hyperlink w:anchor="_Toc243776928" w:history="1">
+      <w:hyperlink w:anchor="_Toc243779759" w:history="1">
         <w:r>
           <w:rPr>
             <w:rStyle w:val="Hipervnculo"/>
@@ -615,7 +615,7 @@
             <w:noProof/>
             <w:webHidden/>
           </w:rPr>
-          <w:instrText xml:space="preserve"> PAGEREF _Toc243776928 \h </w:instrText>
+          <w:instrText xml:space="preserve"> PAGEREF _Toc243779759 \h </w:instrText>
         </w:r>
         <w:r>
           <w:rPr>
@@ -662,7 +662,7 @@
           <w14:ligatures w14:val="standardContextual"/>
         </w:rPr>
       </w:pPr>
-      <w:hyperlink w:anchor="_Toc243776929" w:history="1">
+      <w:hyperlink w:anchor="_Toc243779760" w:history="1">
         <w:r>
           <w:rPr>
             <w:rStyle w:val="Hipervnculo"/>
@@ -689,7 +689,7 @@
             <w:noProof/>
             <w:webHidden/>
           </w:rPr>
-          <w:instrText xml:space="preserve"> PAGEREF _Toc243776929 \h </w:instrText>
+          <w:instrText xml:space="preserve"> PAGEREF _Toc243779760 \h </w:instrText>
         </w:r>
         <w:r>
           <w:rPr>
@@ -736,7 +736,7 @@
           <w14:ligatures w14:val="standardContextual"/>
         </w:rPr>
       </w:pPr>
-      <w:hyperlink w:anchor="_Toc243776930" w:history="1">
+      <w:hyperlink w:anchor="_Toc243779761" w:history="1">
         <w:r>
           <w:rPr>
             <w:rStyle w:val="Hipervnculo"/>
@@ -763,7 +763,7 @@
             <w:noProof/>
             <w:webHidden/>
           </w:rPr>
-          <w:instrText xml:space="preserve"> PAGEREF _Toc243776930 \h </w:instrText>
+          <w:instrText xml:space="preserve"> PAGEREF _Toc243779761 \h </w:instrText>
         </w:r>
         <w:r>
           <w:rPr>
@@ -810,7 +810,7 @@
           <w14:ligatures w14:val="standardContextual"/>
         </w:rPr>
       </w:pPr>
-      <w:hyperlink w:anchor="_Toc243776931" w:history="1">
+      <w:hyperlink w:anchor="_Toc243779762" w:history="1">
         <w:r>
           <w:rPr>
             <w:rStyle w:val="Hipervnculo"/>
@@ -837,7 +837,7 @@
             <w:noProof/>
             <w:webHidden/>
           </w:rPr>
-          <w:instrText xml:space="preserve"> PAGEREF _Toc243776931 \h </w:instrText>
+          <w:instrText xml:space="preserve"> PAGEREF _Toc243779762 \h </w:instrText>
         </w:r>
         <w:r>
           <w:rPr>
@@ -884,7 +884,7 @@
           <w14:ligatures w14:val="standardContextual"/>
         </w:rPr>
       </w:pPr>
-      <w:hyperlink w:anchor="_Toc243776932" w:history="1">
+      <w:hyperlink w:anchor="_Toc243779763" w:history="1">
         <w:r>
           <w:rPr>
             <w:rStyle w:val="Hipervnculo"/>
@@ -911,7 +911,7 @@
             <w:noProof/>
             <w:webHidden/>
           </w:rPr>
-          <w:instrText xml:space="preserve"> PAGEREF _Toc243776932 \h </w:instrText>
+          <w:instrText xml:space="preserve"> PAGEREF _Toc243779763 \h </w:instrText>
         </w:r>
         <w:r>
           <w:rPr>
@@ -958,7 +958,7 @@
           <w14:ligatures w14:val="standardContextual"/>
         </w:rPr>
       </w:pPr>
-      <w:hyperlink w:anchor="_Toc243776933" w:history="1">
+      <w:hyperlink w:anchor="_Toc243779764" w:history="1">
         <w:r>
           <w:rPr>
             <w:rStyle w:val="Hipervnculo"/>
@@ -985,7 +985,7 @@
             <w:noProof/>
             <w:webHidden/>
           </w:rPr>
-          <w:instrText xml:space="preserve"> PAGEREF _Toc243776933 \h </w:instrText>
+          <w:instrText xml:space="preserve"> PAGEREF _Toc243779764 \h </w:instrText>
         </w:r>
         <w:r>
           <w:rPr>
@@ -1032,7 +1032,7 @@
           <w14:ligatures w14:val="standardContextual"/>
         </w:rPr>
       </w:pPr>
-      <w:hyperlink w:anchor="_Toc243776934" w:history="1">
+      <w:hyperlink w:anchor="_Toc243779765" w:history="1">
         <w:r>
           <w:rPr>
             <w:rStyle w:val="Hipervnculo"/>
@@ -1059,7 +1059,7 @@
             <w:noProof/>
             <w:webHidden/>
           </w:rPr>
-          <w:instrText xml:space="preserve"> PAGEREF _Toc243776934 \h </w:instrText>
+          <w:instrText xml:space="preserve"> PAGEREF _Toc243779765 \h </w:instrText>
         </w:r>
         <w:r>
           <w:rPr>
@@ -1106,7 +1106,7 @@
           <w14:ligatures w14:val="standardContextual"/>
         </w:rPr>
       </w:pPr>
-      <w:hyperlink w:anchor="_Toc243776935" w:history="1">
+      <w:hyperlink w:anchor="_Toc243779766" w:history="1">
         <w:r>
           <w:rPr>
             <w:rStyle w:val="Hipervnculo"/>
@@ -1133,7 +1133,7 @@
             <w:noProof/>
             <w:webHidden/>
           </w:rPr>
-          <w:instrText xml:space="preserve"> PAGEREF _Toc243776935 \h </w:instrText>
+          <w:instrText xml:space="preserve"> PAGEREF _Toc243779766 \h </w:instrText>
         </w:r>
         <w:r>
           <w:rPr>
@@ -1180,7 +1180,7 @@
           <w14:ligatures w14:val="standardContextual"/>
         </w:rPr>
       </w:pPr>
-      <w:hyperlink w:anchor="_Toc243776936" w:history="1">
+      <w:hyperlink w:anchor="_Toc243779767" w:history="1">
         <w:r>
           <w:rPr>
             <w:rStyle w:val="Hipervnculo"/>
@@ -1207,7 +1207,7 @@
             <w:noProof/>
             <w:webHidden/>
           </w:rPr>
-          <w:instrText xml:space="preserve"> PAGEREF _Toc243776936 \h </w:instrText>
+          <w:instrText xml:space="preserve"> PAGEREF _Toc243779767 \h </w:instrText>
         </w:r>
         <w:r>
           <w:rPr>
@@ -1227,7 +1227,7 @@
             <w:noProof/>
             <w:webHidden/>
           </w:rPr>
-          <w:t>8</w:t>
+          <w:t>9</w:t>
         </w:r>
         <w:r>
           <w:rPr>
@@ -1254,7 +1254,7 @@
           <w14:ligatures w14:val="standardContextual"/>
         </w:rPr>
       </w:pPr>
-      <w:hyperlink w:anchor="_Toc243776937" w:history="1">
+      <w:hyperlink w:anchor="_Toc243779768" w:history="1">
         <w:r>
           <w:rPr>
             <w:rStyle w:val="Hipervnculo"/>
@@ -1281,7 +1281,7 @@
             <w:noProof/>
             <w:webHidden/>
           </w:rPr>
-          <w:instrText xml:space="preserve"> PAGEREF _Toc243776937 \h </w:instrText>
+          <w:instrText xml:space="preserve"> PAGEREF _Toc243779768 \h </w:instrText>
         </w:r>
         <w:r>
           <w:rPr>
@@ -1301,7 +1301,7 @@
             <w:noProof/>
             <w:webHidden/>
           </w:rPr>
-          <w:t>8</w:t>
+          <w:t>9</w:t>
         </w:r>
         <w:r>
           <w:rPr>
@@ -1328,7 +1328,7 @@
           <w14:ligatures w14:val="standardContextual"/>
         </w:rPr>
       </w:pPr>
-      <w:hyperlink w:anchor="_Toc243776938" w:history="1">
+      <w:hyperlink w:anchor="_Toc243779769" w:history="1">
         <w:r>
           <w:rPr>
             <w:rStyle w:val="Hipervnculo"/>
@@ -1355,7 +1355,7 @@
             <w:noProof/>
             <w:webHidden/>
           </w:rPr>
-          <w:instrText xml:space="preserve"> PAGEREF _Toc243776938 \h </w:instrText>
+          <w:instrText xml:space="preserve"> PAGEREF _Toc243779769 \h </w:instrText>
         </w:r>
         <w:r>
           <w:rPr>
@@ -1375,7 +1375,7 @@
             <w:noProof/>
             <w:webHidden/>
           </w:rPr>
-          <w:t>8</w:t>
+          <w:t>10</w:t>
         </w:r>
         <w:r>
           <w:rPr>
@@ -1402,7 +1402,7 @@
           <w14:ligatures w14:val="standardContextual"/>
         </w:rPr>
       </w:pPr>
-      <w:hyperlink w:anchor="_Toc243776939" w:history="1">
+      <w:hyperlink w:anchor="_Toc243779770" w:history="1">
         <w:r>
           <w:rPr>
             <w:rStyle w:val="Hipervnculo"/>
@@ -1429,7 +1429,7 @@
             <w:noProof/>
             <w:webHidden/>
           </w:rPr>
-          <w:instrText xml:space="preserve"> PAGEREF _Toc243776939 \h </w:instrText>
+          <w:instrText xml:space="preserve"> PAGEREF _Toc243779770 \h </w:instrText>
         </w:r>
         <w:r>
           <w:rPr>
@@ -1449,7 +1449,7 @@
             <w:noProof/>
             <w:webHidden/>
           </w:rPr>
-          <w:t>9</w:t>
+          <w:t>11</w:t>
         </w:r>
         <w:r>
           <w:rPr>
@@ -1476,7 +1476,7 @@
           <w14:ligatures w14:val="standardContextual"/>
         </w:rPr>
       </w:pPr>
-      <w:hyperlink w:anchor="_Toc243776940" w:history="1">
+      <w:hyperlink w:anchor="_Toc243779771" w:history="1">
         <w:r>
           <w:rPr>
             <w:rStyle w:val="Hipervnculo"/>
@@ -1503,7 +1503,7 @@
             <w:noProof/>
             <w:webHidden/>
           </w:rPr>
-          <w:instrText xml:space="preserve"> PAGEREF _Toc243776940 \h </w:instrText>
+          <w:instrText xml:space="preserve"> PAGEREF _Toc243779771 \h </w:instrText>
         </w:r>
         <w:r>
           <w:rPr>
@@ -1523,7 +1523,7 @@
             <w:noProof/>
             <w:webHidden/>
           </w:rPr>
-          <w:t>9</w:t>
+          <w:t>13</w:t>
         </w:r>
         <w:r>
           <w:rPr>
@@ -1550,7 +1550,7 @@
           <w14:ligatures w14:val="standardContextual"/>
         </w:rPr>
       </w:pPr>
-      <w:hyperlink w:anchor="_Toc243776941" w:history="1">
+      <w:hyperlink w:anchor="_Toc243779772" w:history="1">
         <w:r>
           <w:rPr>
             <w:rStyle w:val="Hipervnculo"/>
@@ -1577,7 +1577,7 @@
             <w:noProof/>
             <w:webHidden/>
           </w:rPr>
-          <w:instrText xml:space="preserve"> PAGEREF _Toc243776941 \h </w:instrText>
+          <w:instrText xml:space="preserve"> PAGEREF _Toc243779772 \h </w:instrText>
         </w:r>
         <w:r>
           <w:rPr>
@@ -1597,7 +1597,7 @@
             <w:noProof/>
             <w:webHidden/>
           </w:rPr>
-          <w:t>10</w:t>
+          <w:t>17</w:t>
         </w:r>
         <w:r>
           <w:rPr>
@@ -1624,7 +1624,7 @@
           <w14:ligatures w14:val="standardContextual"/>
         </w:rPr>
       </w:pPr>
-      <w:hyperlink w:anchor="_Toc243776942" w:history="1">
+      <w:hyperlink w:anchor="_Toc243779773" w:history="1">
         <w:r>
           <w:rPr>
             <w:rStyle w:val="Hipervnculo"/>
@@ -1651,7 +1651,7 @@
             <w:noProof/>
             <w:webHidden/>
           </w:rPr>
-          <w:instrText xml:space="preserve"> PAGEREF _Toc243776942 \h </w:instrText>
+          <w:instrText xml:space="preserve"> PAGEREF _Toc243779773 \h </w:instrText>
         </w:r>
         <w:r>
           <w:rPr>
@@ -1671,7 +1671,7 @@
             <w:noProof/>
             <w:webHidden/>
           </w:rPr>
-          <w:t>11</w:t>
+          <w:t>19</w:t>
         </w:r>
         <w:r>
           <w:rPr>
@@ -1698,7 +1698,7 @@
           <w14:ligatures w14:val="standardContextual"/>
         </w:rPr>
       </w:pPr>
-      <w:hyperlink w:anchor="_Toc243776943" w:history="1">
+      <w:hyperlink w:anchor="_Toc243779774" w:history="1">
         <w:r>
           <w:rPr>
             <w:rStyle w:val="Hipervnculo"/>
@@ -1725,7 +1725,7 @@
             <w:noProof/>
             <w:webHidden/>
           </w:rPr>
-          <w:instrText xml:space="preserve"> PAGEREF _Toc243776943 \h </w:instrText>
+          <w:instrText xml:space="preserve"> PAGEREF _Toc243779774 \h </w:instrText>
         </w:r>
         <w:r>
           <w:rPr>
@@ -1745,7 +1745,7 @@
             <w:noProof/>
             <w:webHidden/>
           </w:rPr>
-          <w:t>11</w:t>
+          <w:t>21</w:t>
         </w:r>
         <w:r>
           <w:rPr>
@@ -1772,7 +1772,7 @@
           <w14:ligatures w14:val="standardContextual"/>
         </w:rPr>
       </w:pPr>
-      <w:hyperlink w:anchor="_Toc243776944" w:history="1">
+      <w:hyperlink w:anchor="_Toc243779775" w:history="1">
         <w:r>
           <w:rPr>
             <w:rStyle w:val="Hipervnculo"/>
@@ -1799,7 +1799,7 @@
             <w:noProof/>
             <w:webHidden/>
           </w:rPr>
-          <w:instrText xml:space="preserve"> PAGEREF _Toc243776944 \h </w:instrText>
+          <w:instrText xml:space="preserve"> PAGEREF _Toc243779775 \h </w:instrText>
         </w:r>
         <w:r>
           <w:rPr>
@@ -1819,7 +1819,7 @@
             <w:noProof/>
             <w:webHidden/>
           </w:rPr>
-          <w:t>12</w:t>
+          <w:t>22</w:t>
         </w:r>
         <w:r>
           <w:rPr>
@@ -1846,7 +1846,7 @@
           <w14:ligatures w14:val="standardContextual"/>
         </w:rPr>
       </w:pPr>
-      <w:hyperlink w:anchor="_Toc243776945" w:history="1">
+      <w:hyperlink w:anchor="_Toc243779776" w:history="1">
         <w:r>
           <w:rPr>
             <w:rStyle w:val="Hipervnculo"/>
@@ -1873,7 +1873,7 @@
             <w:noProof/>
             <w:webHidden/>
           </w:rPr>
-          <w:instrText xml:space="preserve"> PAGEREF _Toc243776945 \h </w:instrText>
+          <w:instrText xml:space="preserve"> PAGEREF _Toc243779776 \h </w:instrText>
         </w:r>
         <w:r>
           <w:rPr>
@@ -1893,7 +1893,7 @@
             <w:noProof/>
             <w:webHidden/>
           </w:rPr>
-          <w:t>12</w:t>
+          <w:t>22</w:t>
         </w:r>
         <w:r>
           <w:rPr>
@@ -1920,7 +1920,7 @@
           <w14:ligatures w14:val="standardContextual"/>
         </w:rPr>
       </w:pPr>
-      <w:hyperlink w:anchor="_Toc243776946" w:history="1">
+      <w:hyperlink w:anchor="_Toc243779777" w:history="1">
         <w:r>
           <w:rPr>
             <w:rStyle w:val="Hipervnculo"/>
@@ -1947,7 +1947,7 @@
             <w:noProof/>
             <w:webHidden/>
           </w:rPr>
-          <w:instrText xml:space="preserve"> PAGEREF _Toc243776946 \h </w:instrText>
+          <w:instrText xml:space="preserve"> PAGEREF _Toc243779777 \h </w:instrText>
         </w:r>
         <w:r>
           <w:rPr>
@@ -1967,7 +1967,7 @@
             <w:noProof/>
             <w:webHidden/>
           </w:rPr>
-          <w:t>12</w:t>
+          <w:t>22</w:t>
         </w:r>
         <w:r>
           <w:rPr>
@@ -1994,7 +1994,7 @@
           <w14:ligatures w14:val="standardContextual"/>
         </w:rPr>
       </w:pPr>
-      <w:hyperlink w:anchor="_Toc243776947" w:history="1">
+      <w:hyperlink w:anchor="_Toc243779778" w:history="1">
         <w:r>
           <w:rPr>
             <w:rStyle w:val="Hipervnculo"/>
@@ -2021,7 +2021,7 @@
             <w:noProof/>
             <w:webHidden/>
           </w:rPr>
-          <w:instrText xml:space="preserve"> PAGEREF _Toc243776947 \h </w:instrText>
+          <w:instrText xml:space="preserve"> PAGEREF _Toc243779778 \h </w:instrText>
         </w:r>
         <w:r>
           <w:rPr>
@@ -2041,7 +2041,7 @@
             <w:noProof/>
             <w:webHidden/>
           </w:rPr>
-          <w:t>12</w:t>
+          <w:t>22</w:t>
         </w:r>
         <w:r>
           <w:rPr>
@@ -2068,7 +2068,7 @@
           <w14:ligatures w14:val="standardContextual"/>
         </w:rPr>
       </w:pPr>
-      <w:hyperlink w:anchor="_Toc243776948" w:history="1">
+      <w:hyperlink w:anchor="_Toc243779779" w:history="1">
         <w:r>
           <w:rPr>
             <w:rStyle w:val="Hipervnculo"/>
@@ -2095,7 +2095,7 @@
             <w:noProof/>
             <w:webHidden/>
           </w:rPr>
-          <w:instrText xml:space="preserve"> PAGEREF _Toc243776948 \h </w:instrText>
+          <w:instrText xml:space="preserve"> PAGEREF _Toc243779779 \h </w:instrText>
         </w:r>
         <w:r>
           <w:rPr>
@@ -2115,7 +2115,7 @@
             <w:noProof/>
             <w:webHidden/>
           </w:rPr>
-          <w:t>12</w:t>
+          <w:t>22</w:t>
         </w:r>
         <w:r>
           <w:rPr>
@@ -2142,7 +2142,7 @@
           <w14:ligatures w14:val="standardContextual"/>
         </w:rPr>
       </w:pPr>
-      <w:hyperlink w:anchor="_Toc243776949" w:history="1">
+      <w:hyperlink w:anchor="_Toc243779780" w:history="1">
         <w:r>
           <w:rPr>
             <w:rStyle w:val="Hipervnculo"/>
@@ -2169,7 +2169,7 @@
             <w:noProof/>
             <w:webHidden/>
           </w:rPr>
-          <w:instrText xml:space="preserve"> PAGEREF _Toc243776949 \h </w:instrText>
+          <w:instrText xml:space="preserve"> PAGEREF _Toc243779780 \h </w:instrText>
         </w:r>
         <w:r>
           <w:rPr>
@@ -2189,7 +2189,7 @@
             <w:noProof/>
             <w:webHidden/>
           </w:rPr>
-          <w:t>12</w:t>
+          <w:t>22</w:t>
         </w:r>
         <w:r>
           <w:rPr>
@@ -2216,7 +2216,7 @@
           <w14:ligatures w14:val="standardContextual"/>
         </w:rPr>
       </w:pPr>
-      <w:hyperlink w:anchor="_Toc243776950" w:history="1">
+      <w:hyperlink w:anchor="_Toc243779781" w:history="1">
         <w:r>
           <w:rPr>
             <w:rStyle w:val="Hipervnculo"/>
@@ -2243,7 +2243,7 @@
             <w:noProof/>
             <w:webHidden/>
           </w:rPr>
-          <w:instrText xml:space="preserve"> PAGEREF _Toc243776950 \h </w:instrText>
+          <w:instrText xml:space="preserve"> PAGEREF _Toc243779781 \h </w:instrText>
         </w:r>
         <w:r>
           <w:rPr>
@@ -2263,7 +2263,7 @@
             <w:noProof/>
             <w:webHidden/>
           </w:rPr>
-          <w:t>13</w:t>
+          <w:t>23</w:t>
         </w:r>
         <w:r>
           <w:rPr>
@@ -2290,7 +2290,7 @@
           <w14:ligatures w14:val="standardContextual"/>
         </w:rPr>
       </w:pPr>
-      <w:hyperlink w:anchor="_Toc243776951" w:history="1">
+      <w:hyperlink w:anchor="_Toc243779782" w:history="1">
         <w:r>
           <w:rPr>
             <w:rStyle w:val="Hipervnculo"/>
@@ -2317,7 +2317,7 @@
             <w:noProof/>
             <w:webHidden/>
           </w:rPr>
-          <w:instrText xml:space="preserve"> PAGEREF _Toc243776951 \h </w:instrText>
+          <w:instrText xml:space="preserve"> PAGEREF _Toc243779782 \h </w:instrText>
         </w:r>
         <w:r>
           <w:rPr>
@@ -2337,7 +2337,7 @@
             <w:noProof/>
             <w:webHidden/>
           </w:rPr>
-          <w:t>13</w:t>
+          <w:t>23</w:t>
         </w:r>
         <w:r>
           <w:rPr>
@@ -2364,7 +2364,7 @@
           <w14:ligatures w14:val="standardContextual"/>
         </w:rPr>
       </w:pPr>
-      <w:hyperlink w:anchor="_Toc243776952" w:history="1">
+      <w:hyperlink w:anchor="_Toc243779783" w:history="1">
         <w:r>
           <w:rPr>
             <w:rStyle w:val="Hipervnculo"/>
@@ -2391,7 +2391,7 @@
             <w:noProof/>
             <w:webHidden/>
           </w:rPr>
-          <w:instrText xml:space="preserve"> PAGEREF _Toc243776952 \h </w:instrText>
+          <w:instrText xml:space="preserve"> PAGEREF _Toc243779783 \h </w:instrText>
         </w:r>
         <w:r>
           <w:rPr>
@@ -2411,7 +2411,7 @@
             <w:noProof/>
             <w:webHidden/>
           </w:rPr>
-          <w:t>13</w:t>
+          <w:t>23</w:t>
         </w:r>
         <w:r>
           <w:rPr>
@@ -2438,7 +2438,7 @@
           <w14:ligatures w14:val="standardContextual"/>
         </w:rPr>
       </w:pPr>
-      <w:hyperlink w:anchor="_Toc243776953" w:history="1">
+      <w:hyperlink w:anchor="_Toc243779784" w:history="1">
         <w:r>
           <w:rPr>
             <w:rStyle w:val="Hipervnculo"/>
@@ -2465,7 +2465,7 @@
             <w:noProof/>
             <w:webHidden/>
           </w:rPr>
-          <w:instrText xml:space="preserve"> PAGEREF _Toc243776953 \h </w:instrText>
+          <w:instrText xml:space="preserve"> PAGEREF _Toc243779784 \h </w:instrText>
         </w:r>
         <w:r>
           <w:rPr>
@@ -2485,7 +2485,7 @@
             <w:noProof/>
             <w:webHidden/>
           </w:rPr>
-          <w:t>13</w:t>
+          <w:t>23</w:t>
         </w:r>
         <w:r>
           <w:rPr>
@@ -2512,7 +2512,7 @@
           <w14:ligatures w14:val="standardContextual"/>
         </w:rPr>
       </w:pPr>
-      <w:hyperlink w:anchor="_Toc243776954" w:history="1">
+      <w:hyperlink w:anchor="_Toc243779785" w:history="1">
         <w:r>
           <w:rPr>
             <w:rStyle w:val="Hipervnculo"/>
@@ -2539,7 +2539,7 @@
             <w:noProof/>
             <w:webHidden/>
           </w:rPr>
-          <w:instrText xml:space="preserve"> PAGEREF _Toc243776954 \h </w:instrText>
+          <w:instrText xml:space="preserve"> PAGEREF _Toc243779785 \h </w:instrText>
         </w:r>
         <w:r>
           <w:rPr>
@@ -2559,7 +2559,7 @@
             <w:noProof/>
             <w:webHidden/>
           </w:rPr>
-          <w:t>14</w:t>
+          <w:t>24</w:t>
         </w:r>
         <w:r>
           <w:rPr>
@@ -2586,7 +2586,7 @@
           <w14:ligatures w14:val="standardContextual"/>
         </w:rPr>
       </w:pPr>
-      <w:hyperlink w:anchor="_Toc243776955" w:history="1">
+      <w:hyperlink w:anchor="_Toc243779786" w:history="1">
         <w:r>
           <w:rPr>
             <w:rStyle w:val="Hipervnculo"/>
@@ -2613,7 +2613,7 @@
             <w:noProof/>
             <w:webHidden/>
           </w:rPr>
-          <w:instrText xml:space="preserve"> PAGEREF _Toc243776955 \h </w:instrText>
+          <w:instrText xml:space="preserve"> PAGEREF _Toc243779786 \h </w:instrText>
         </w:r>
         <w:r>
           <w:rPr>
@@ -2633,7 +2633,7 @@
             <w:noProof/>
             <w:webHidden/>
           </w:rPr>
-          <w:t>14</w:t>
+          <w:t>24</w:t>
         </w:r>
         <w:r>
           <w:rPr>
@@ -2660,7 +2660,7 @@
           <w14:ligatures w14:val="standardContextual"/>
         </w:rPr>
       </w:pPr>
-      <w:hyperlink w:anchor="_Toc243776956" w:history="1">
+      <w:hyperlink w:anchor="_Toc243779787" w:history="1">
         <w:r>
           <w:rPr>
             <w:rStyle w:val="Hipervnculo"/>
@@ -2702,7 +2702,7 @@
             <w:noProof/>
             <w:webHidden/>
           </w:rPr>
-          <w:instrText xml:space="preserve"> PAGEREF _Toc243776956 \h </w:instrText>
+          <w:instrText xml:space="preserve"> PAGEREF _Toc243779787 \h </w:instrText>
         </w:r>
         <w:r>
           <w:rPr>
@@ -2722,7 +2722,7 @@
             <w:noProof/>
             <w:webHidden/>
           </w:rPr>
-          <w:t>14</w:t>
+          <w:t>24</w:t>
         </w:r>
         <w:r>
           <w:rPr>
@@ -2749,7 +2749,7 @@
           <w14:ligatures w14:val="standardContextual"/>
         </w:rPr>
       </w:pPr>
-      <w:hyperlink w:anchor="_Toc243776957" w:history="1">
+      <w:hyperlink w:anchor="_Toc243779788" w:history="1">
         <w:r>
           <w:rPr>
             <w:rStyle w:val="Hipervnculo"/>
@@ -2806,7 +2806,7 @@
             <w:noProof/>
             <w:webHidden/>
           </w:rPr>
-          <w:instrText xml:space="preserve"> PAGEREF _Toc243776957 \h </w:instrText>
+          <w:instrText xml:space="preserve"> PAGEREF _Toc243779788 \h </w:instrText>
         </w:r>
         <w:r>
           <w:rPr>
@@ -2826,7 +2826,7 @@
             <w:noProof/>
             <w:webHidden/>
           </w:rPr>
-          <w:t>14</w:t>
+          <w:t>24</w:t>
         </w:r>
         <w:r>
           <w:rPr>
@@ -2853,7 +2853,7 @@
           <w14:ligatures w14:val="standardContextual"/>
         </w:rPr>
       </w:pPr>
-      <w:hyperlink w:anchor="_Toc243776958" w:history="1">
+      <w:hyperlink w:anchor="_Toc243779789" w:history="1">
         <w:r>
           <w:rPr>
             <w:rStyle w:val="Hipervnculo"/>
@@ -2880,7 +2880,7 @@
             <w:noProof/>
             <w:webHidden/>
           </w:rPr>
-          <w:instrText xml:space="preserve"> PAGEREF _Toc243776958 \h </w:instrText>
+          <w:instrText xml:space="preserve"> PAGEREF _Toc243779789 \h </w:instrText>
         </w:r>
         <w:r>
           <w:rPr>
@@ -2900,7 +2900,7 @@
             <w:noProof/>
             <w:webHidden/>
           </w:rPr>
-          <w:t>15</w:t>
+          <w:t>25</w:t>
         </w:r>
         <w:r>
           <w:rPr>
@@ -2927,7 +2927,7 @@
           <w14:ligatures w14:val="standardContextual"/>
         </w:rPr>
       </w:pPr>
-      <w:hyperlink w:anchor="_Toc243776959" w:history="1">
+      <w:hyperlink w:anchor="_Toc243779790" w:history="1">
         <w:r>
           <w:rPr>
             <w:rStyle w:val="Hipervnculo"/>
@@ -2954,7 +2954,7 @@
             <w:noProof/>
             <w:webHidden/>
           </w:rPr>
-          <w:instrText xml:space="preserve"> PAGEREF _Toc243776959 \h </w:instrText>
+          <w:instrText xml:space="preserve"> PAGEREF _Toc243779790 \h </w:instrText>
         </w:r>
         <w:r>
           <w:rPr>
@@ -2974,7 +2974,7 @@
             <w:noProof/>
             <w:webHidden/>
           </w:rPr>
-          <w:t>15</w:t>
+          <w:t>25</w:t>
         </w:r>
         <w:r>
           <w:rPr>
@@ -3001,7 +3001,7 @@
           <w14:ligatures w14:val="standardContextual"/>
         </w:rPr>
       </w:pPr>
-      <w:hyperlink w:anchor="_Toc243776960" w:history="1">
+      <w:hyperlink w:anchor="_Toc243779791" w:history="1">
         <w:r>
           <w:rPr>
             <w:rStyle w:val="Hipervnculo"/>
@@ -3028,7 +3028,7 @@
             <w:noProof/>
             <w:webHidden/>
           </w:rPr>
-          <w:instrText xml:space="preserve"> PAGEREF _Toc243776960 \h </w:instrText>
+          <w:instrText xml:space="preserve"> PAGEREF _Toc243779791 \h </w:instrText>
         </w:r>
         <w:r>
           <w:rPr>
@@ -3048,7 +3048,7 @@
             <w:noProof/>
             <w:webHidden/>
           </w:rPr>
-          <w:t>15</w:t>
+          <w:t>25</w:t>
         </w:r>
         <w:r>
           <w:rPr>
@@ -3075,7 +3075,7 @@
           <w14:ligatures w14:val="standardContextual"/>
         </w:rPr>
       </w:pPr>
-      <w:hyperlink w:anchor="_Toc243776961" w:history="1">
+      <w:hyperlink w:anchor="_Toc243779792" w:history="1">
         <w:r>
           <w:rPr>
             <w:rStyle w:val="Hipervnculo"/>
@@ -3102,7 +3102,7 @@
             <w:noProof/>
             <w:webHidden/>
           </w:rPr>
-          <w:instrText xml:space="preserve"> PAGEREF _Toc243776961 \h </w:instrText>
+          <w:instrText xml:space="preserve"> PAGEREF _Toc243779792 \h </w:instrText>
         </w:r>
         <w:r>
           <w:rPr>
@@ -3122,7 +3122,7 @@
             <w:noProof/>
             <w:webHidden/>
           </w:rPr>
-          <w:t>17</w:t>
+          <w:t>27</w:t>
         </w:r>
         <w:r>
           <w:rPr>
@@ -3149,7 +3149,7 @@
           <w14:ligatures w14:val="standardContextual"/>
         </w:rPr>
       </w:pPr>
-      <w:hyperlink w:anchor="_Toc243776962" w:history="1">
+      <w:hyperlink w:anchor="_Toc243779793" w:history="1">
         <w:r>
           <w:rPr>
             <w:rStyle w:val="Hipervnculo"/>
@@ -3176,7 +3176,7 @@
             <w:noProof/>
             <w:webHidden/>
           </w:rPr>
-          <w:instrText xml:space="preserve"> PAGEREF _Toc243776962 \h </w:instrText>
+          <w:instrText xml:space="preserve"> PAGEREF _Toc243779793 \h </w:instrText>
         </w:r>
         <w:r>
           <w:rPr>
@@ -3196,7 +3196,7 @@
             <w:noProof/>
             <w:webHidden/>
           </w:rPr>
-          <w:t>17</w:t>
+          <w:t>27</w:t>
         </w:r>
         <w:r>
           <w:rPr>
@@ -3223,7 +3223,7 @@
           <w14:ligatures w14:val="standardContextual"/>
         </w:rPr>
       </w:pPr>
-      <w:hyperlink w:anchor="_Toc243776963" w:history="1">
+      <w:hyperlink w:anchor="_Toc243779794" w:history="1">
         <w:r>
           <w:rPr>
             <w:rStyle w:val="Hipervnculo"/>
@@ -3250,7 +3250,7 @@
             <w:noProof/>
             <w:webHidden/>
           </w:rPr>
-          <w:instrText xml:space="preserve"> PAGEREF _Toc243776963 \h </w:instrText>
+          <w:instrText xml:space="preserve"> PAGEREF _Toc243779794 \h </w:instrText>
         </w:r>
         <w:r>
           <w:rPr>
@@ -3270,7 +3270,7 @@
             <w:noProof/>
             <w:webHidden/>
           </w:rPr>
-          <w:t>17</w:t>
+          <w:t>27</w:t>
         </w:r>
         <w:r>
           <w:rPr>
@@ -3297,7 +3297,7 @@
           <w14:ligatures w14:val="standardContextual"/>
         </w:rPr>
       </w:pPr>
-      <w:hyperlink w:anchor="_Toc243776964" w:history="1">
+      <w:hyperlink w:anchor="_Toc243779795" w:history="1">
         <w:r>
           <w:rPr>
             <w:rStyle w:val="Hipervnculo"/>
@@ -3324,7 +3324,7 @@
             <w:noProof/>
             <w:webHidden/>
           </w:rPr>
-          <w:instrText xml:space="preserve"> PAGEREF _Toc243776964 \h </w:instrText>
+          <w:instrText xml:space="preserve"> PAGEREF _Toc243779795 \h </w:instrText>
         </w:r>
         <w:r>
           <w:rPr>
@@ -3344,7 +3344,7 @@
             <w:noProof/>
             <w:webHidden/>
           </w:rPr>
-          <w:t>18</w:t>
+          <w:t>28</w:t>
         </w:r>
         <w:r>
           <w:rPr>
@@ -3371,7 +3371,7 @@
           <w14:ligatures w14:val="standardContextual"/>
         </w:rPr>
       </w:pPr>
-      <w:hyperlink w:anchor="_Toc243776965" w:history="1">
+      <w:hyperlink w:anchor="_Toc243779796" w:history="1">
         <w:r>
           <w:rPr>
             <w:rStyle w:val="Hipervnculo"/>
@@ -3398,7 +3398,7 @@
             <w:noProof/>
             <w:webHidden/>
           </w:rPr>
-          <w:instrText xml:space="preserve"> PAGEREF _Toc243776965 \h </w:instrText>
+          <w:instrText xml:space="preserve"> PAGEREF _Toc243779796 \h </w:instrText>
         </w:r>
         <w:r>
           <w:rPr>
@@ -3418,7 +3418,7 @@
             <w:noProof/>
             <w:webHidden/>
           </w:rPr>
-          <w:t>18</w:t>
+          <w:t>28</w:t>
         </w:r>
         <w:r>
           <w:rPr>
@@ -3445,7 +3445,7 @@
           <w14:ligatures w14:val="standardContextual"/>
         </w:rPr>
       </w:pPr>
-      <w:hyperlink w:anchor="_Toc243776966" w:history="1">
+      <w:hyperlink w:anchor="_Toc243779797" w:history="1">
         <w:r>
           <w:rPr>
             <w:rStyle w:val="Hipervnculo"/>
@@ -3472,7 +3472,7 @@
             <w:noProof/>
             <w:webHidden/>
           </w:rPr>
-          <w:instrText xml:space="preserve"> PAGEREF _Toc243776966 \h </w:instrText>
+          <w:instrText xml:space="preserve"> PAGEREF _Toc243779797 \h </w:instrText>
         </w:r>
         <w:r>
           <w:rPr>
@@ -3492,7 +3492,7 @@
             <w:noProof/>
             <w:webHidden/>
           </w:rPr>
-          <w:t>18</w:t>
+          <w:t>28</w:t>
         </w:r>
         <w:r>
           <w:rPr>
@@ -3519,7 +3519,7 @@
           <w14:ligatures w14:val="standardContextual"/>
         </w:rPr>
       </w:pPr>
-      <w:hyperlink w:anchor="_Toc243776967" w:history="1">
+      <w:hyperlink w:anchor="_Toc243779798" w:history="1">
         <w:r>
           <w:rPr>
             <w:rStyle w:val="Hipervnculo"/>
@@ -3546,7 +3546,7 @@
             <w:noProof/>
             <w:webHidden/>
           </w:rPr>
-          <w:instrText xml:space="preserve"> PAGEREF _Toc243776967 \h </w:instrText>
+          <w:instrText xml:space="preserve"> PAGEREF _Toc243779798 \h </w:instrText>
         </w:r>
         <w:r>
           <w:rPr>
@@ -3566,7 +3566,7 @@
             <w:noProof/>
             <w:webHidden/>
           </w:rPr>
-          <w:t>18</w:t>
+          <w:t>28</w:t>
         </w:r>
         <w:r>
           <w:rPr>
@@ -3593,7 +3593,7 @@
           <w14:ligatures w14:val="standardContextual"/>
         </w:rPr>
       </w:pPr>
-      <w:hyperlink w:anchor="_Toc243776968" w:history="1">
+      <w:hyperlink w:anchor="_Toc243779799" w:history="1">
         <w:r>
           <w:rPr>
             <w:rStyle w:val="Hipervnculo"/>
@@ -3620,7 +3620,7 @@
             <w:noProof/>
             <w:webHidden/>
           </w:rPr>
-          <w:instrText xml:space="preserve"> PAGEREF _Toc243776968 \h </w:instrText>
+          <w:instrText xml:space="preserve"> PAGEREF _Toc243779799 \h </w:instrText>
         </w:r>
         <w:r>
           <w:rPr>
@@ -3640,7 +3640,7 @@
             <w:noProof/>
             <w:webHidden/>
           </w:rPr>
-          <w:t>19</w:t>
+          <w:t>29</w:t>
         </w:r>
         <w:r>
           <w:rPr>
@@ -3667,7 +3667,7 @@
           <w14:ligatures w14:val="standardContextual"/>
         </w:rPr>
       </w:pPr>
-      <w:hyperlink w:anchor="_Toc243776969" w:history="1">
+      <w:hyperlink w:anchor="_Toc243779800" w:history="1">
         <w:r>
           <w:rPr>
             <w:rStyle w:val="Hipervnculo"/>
@@ -3694,7 +3694,7 @@
             <w:noProof/>
             <w:webHidden/>
           </w:rPr>
-          <w:instrText xml:space="preserve"> PAGEREF _Toc243776969 \h </w:instrText>
+          <w:instrText xml:space="preserve"> PAGEREF _Toc243779800 \h </w:instrText>
         </w:r>
         <w:r>
           <w:rPr>
@@ -3714,7 +3714,7 @@
             <w:noProof/>
             <w:webHidden/>
           </w:rPr>
-          <w:t>20</w:t>
+          <w:t>30</w:t>
         </w:r>
         <w:r>
           <w:rPr>
@@ -3741,7 +3741,7 @@
           <w14:ligatures w14:val="standardContextual"/>
         </w:rPr>
       </w:pPr>
-      <w:hyperlink w:anchor="_Toc243776970" w:history="1">
+      <w:hyperlink w:anchor="_Toc243779801" w:history="1">
         <w:r>
           <w:rPr>
             <w:rStyle w:val="Hipervnculo"/>
@@ -3783,7 +3783,7 @@
             <w:noProof/>
             <w:webHidden/>
           </w:rPr>
-          <w:instrText xml:space="preserve"> PAGEREF _Toc243776970 \h </w:instrText>
+          <w:instrText xml:space="preserve"> PAGEREF _Toc243779801 \h </w:instrText>
         </w:r>
         <w:r>
           <w:rPr>
@@ -3803,7 +3803,7 @@
             <w:noProof/>
             <w:webHidden/>
           </w:rPr>
-          <w:t>20</w:t>
+          <w:t>30</w:t>
         </w:r>
         <w:r>
           <w:rPr>
@@ -3830,7 +3830,7 @@
           <w14:ligatures w14:val="standardContextual"/>
         </w:rPr>
       </w:pPr>
-      <w:hyperlink w:anchor="_Toc243776971" w:history="1">
+      <w:hyperlink w:anchor="_Toc243779802" w:history="1">
         <w:r>
           <w:rPr>
             <w:rStyle w:val="Hipervnculo"/>
@@ -3872,7 +3872,7 @@
             <w:noProof/>
             <w:webHidden/>
           </w:rPr>
-          <w:instrText xml:space="preserve"> PAGEREF _Toc243776971 \h </w:instrText>
+          <w:instrText xml:space="preserve"> PAGEREF _Toc243779802 \h </w:instrText>
         </w:r>
         <w:r>
           <w:rPr>
@@ -3892,7 +3892,7 @@
             <w:noProof/>
             <w:webHidden/>
           </w:rPr>
-          <w:t>20</w:t>
+          <w:t>30</w:t>
         </w:r>
         <w:r>
           <w:rPr>
@@ -3919,7 +3919,7 @@
           <w14:ligatures w14:val="standardContextual"/>
         </w:rPr>
       </w:pPr>
-      <w:hyperlink w:anchor="_Toc243776972" w:history="1">
+      <w:hyperlink w:anchor="_Toc243779803" w:history="1">
         <w:r>
           <w:rPr>
             <w:rStyle w:val="Hipervnculo"/>
@@ -3961,7 +3961,7 @@
             <w:noProof/>
             <w:webHidden/>
           </w:rPr>
-          <w:instrText xml:space="preserve"> PAGEREF _Toc243776972 \h </w:instrText>
+          <w:instrText xml:space="preserve"> PAGEREF _Toc243779803 \h </w:instrText>
         </w:r>
         <w:r>
           <w:rPr>
@@ -3981,7 +3981,7 @@
             <w:noProof/>
             <w:webHidden/>
           </w:rPr>
-          <w:t>21</w:t>
+          <w:t>31</w:t>
         </w:r>
         <w:r>
           <w:rPr>
@@ -4008,7 +4008,7 @@
           <w14:ligatures w14:val="standardContextual"/>
         </w:rPr>
       </w:pPr>
-      <w:hyperlink w:anchor="_Toc243776973" w:history="1">
+      <w:hyperlink w:anchor="_Toc243779804" w:history="1">
         <w:r>
           <w:rPr>
             <w:rStyle w:val="Hipervnculo"/>
@@ -4050,7 +4050,7 @@
             <w:noProof/>
             <w:webHidden/>
           </w:rPr>
-          <w:instrText xml:space="preserve"> PAGEREF _Toc243776973 \h </w:instrText>
+          <w:instrText xml:space="preserve"> PAGEREF _Toc243779804 \h </w:instrText>
         </w:r>
         <w:r>
           <w:rPr>
@@ -4070,7 +4070,7 @@
             <w:noProof/>
             <w:webHidden/>
           </w:rPr>
-          <w:t>21</w:t>
+          <w:t>31</w:t>
         </w:r>
         <w:r>
           <w:rPr>
@@ -4097,7 +4097,7 @@
           <w14:ligatures w14:val="standardContextual"/>
         </w:rPr>
       </w:pPr>
-      <w:hyperlink w:anchor="_Toc243776974" w:history="1">
+      <w:hyperlink w:anchor="_Toc243779805" w:history="1">
         <w:r>
           <w:rPr>
             <w:rStyle w:val="Hipervnculo"/>
@@ -4139,7 +4139,7 @@
             <w:noProof/>
             <w:webHidden/>
           </w:rPr>
-          <w:instrText xml:space="preserve"> PAGEREF _Toc243776974 \h </w:instrText>
+          <w:instrText xml:space="preserve"> PAGEREF _Toc243779805 \h </w:instrText>
         </w:r>
         <w:r>
           <w:rPr>
@@ -4159,7 +4159,7 @@
             <w:noProof/>
             <w:webHidden/>
           </w:rPr>
-          <w:t>22</w:t>
+          <w:t>32</w:t>
         </w:r>
         <w:r>
           <w:rPr>
@@ -4186,7 +4186,7 @@
           <w14:ligatures w14:val="standardContextual"/>
         </w:rPr>
       </w:pPr>
-      <w:hyperlink w:anchor="_Toc243776975" w:history="1">
+      <w:hyperlink w:anchor="_Toc243779806" w:history="1">
         <w:r>
           <w:rPr>
             <w:rStyle w:val="Hipervnculo"/>
@@ -4213,7 +4213,7 @@
             <w:noProof/>
             <w:webHidden/>
           </w:rPr>
-          <w:instrText xml:space="preserve"> PAGEREF _Toc243776975 \h </w:instrText>
+          <w:instrText xml:space="preserve"> PAGEREF _Toc243779806 \h </w:instrText>
         </w:r>
         <w:r>
           <w:rPr>
@@ -4233,7 +4233,7 @@
             <w:noProof/>
             <w:webHidden/>
           </w:rPr>
-          <w:t>22</w:t>
+          <w:t>32</w:t>
         </w:r>
         <w:r>
           <w:rPr>
@@ -4268,7 +4268,7 @@
       <w:pPr>
         <w:pStyle w:val="Ttulo1"/>
       </w:pPr>
-      <w:bookmarkStart w:id="1" w:name="_Toc243776923"/>
+      <w:bookmarkStart w:id="1" w:name="_Toc243779754"/>
       <w:r>
         <w:t>Visión general e instalación</w:t>
       </w:r>
@@ -4604,7 +4604,7 @@
       <w:pPr>
         <w:pStyle w:val="Ttulo2"/>
       </w:pPr>
-      <w:bookmarkStart w:id="2" w:name="_Toc243776924"/>
+      <w:bookmarkStart w:id="2" w:name="_Toc243779755"/>
       <w:r>
         <w:t>Puesta en marcha (desarrollo)</w:t>
       </w:r>
@@ -4805,7 +4805,7 @@
       <w:pPr>
         <w:pStyle w:val="Ttulo2"/>
       </w:pPr>
-      <w:bookmarkStart w:id="3" w:name="_Toc243776925"/>
+      <w:bookmarkStart w:id="3" w:name="_Toc243779756"/>
       <w:r>
         <w:t>Datos de prueba</w:t>
       </w:r>
@@ -5445,7 +5445,7 @@
       <w:pPr>
         <w:pStyle w:val="Ttulo2"/>
       </w:pPr>
-      <w:bookmarkStart w:id="4" w:name="_Toc243776926"/>
+      <w:bookmarkStart w:id="4" w:name="_Toc243779757"/>
       <w:r>
         <w:t>Comandos útiles</w:t>
       </w:r>
@@ -5642,7 +5642,7 @@
       <w:pPr>
         <w:pStyle w:val="Ttulo2"/>
       </w:pPr>
-      <w:bookmarkStart w:id="5" w:name="_Toc243776927"/>
+      <w:bookmarkStart w:id="5" w:name="_Toc243779758"/>
       <w:r>
         <w:t>Estructura del repositorio</w:t>
       </w:r>
@@ -5853,7 +5853,7 @@
       <w:pPr>
         <w:pStyle w:val="Ttulo2"/>
       </w:pPr>
-      <w:bookmarkStart w:id="6" w:name="_Toc243776928"/>
+      <w:bookmarkStart w:id="6" w:name="_Toc243779759"/>
       <w:r>
         <w:t>Roles y permisos (resumen)</w:t>
       </w:r>
@@ -6958,7 +6958,7 @@
       <w:pPr>
         <w:pStyle w:val="Ttulo2"/>
       </w:pPr>
-      <w:bookmarkStart w:id="7" w:name="_Toc243776929"/>
+      <w:bookmarkStart w:id="7" w:name="_Toc243779760"/>
       <w:r>
         <w:t>Producción</w:t>
       </w:r>
@@ -7057,7 +7057,7 @@
       <w:pPr>
         <w:pStyle w:val="Ttulo1"/>
       </w:pPr>
-      <w:bookmarkStart w:id="8" w:name="_Toc243776930"/>
+      <w:bookmarkStart w:id="8" w:name="_Toc243779761"/>
       <w:r>
         <w:t>Manual de usuario</w:t>
       </w:r>
@@ -7076,7 +7076,7 @@
       <w:pPr>
         <w:pStyle w:val="Ttulo2"/>
       </w:pPr>
-      <w:bookmarkStart w:id="9" w:name="_Toc243776931"/>
+      <w:bookmarkStart w:id="9" w:name="_Toc243779762"/>
       <w:r>
         <w:t>1. Conceptos básicos</w:t>
       </w:r>
@@ -7511,7 +7511,7 @@
       <w:pPr>
         <w:pStyle w:val="Ttulo2"/>
       </w:pPr>
-      <w:bookmarkStart w:id="10" w:name="_Toc243776932"/>
+      <w:bookmarkStart w:id="10" w:name="_Toc243779763"/>
       <w:r>
         <w:t>2. Roles</w:t>
       </w:r>
@@ -7948,7 +7948,7 @@
       <w:pPr>
         <w:pStyle w:val="Ttulo3"/>
       </w:pPr>
-      <w:bookmarkStart w:id="11" w:name="_Toc243776933"/>
+      <w:bookmarkStart w:id="11" w:name="_Toc243779764"/>
       <w:r>
         <w:t>Usuario con y sin sucursal</w:t>
       </w:r>
@@ -7999,9 +7999,125 @@
     </w:p>
     <w:p>
       <w:pPr>
+        <w:jc w:val="center"/>
+      </w:pPr>
+      <w:r>
+        <w:rPr>
+          <w:noProof/>
+        </w:rPr>
+        <w:drawing>
+          <wp:inline distT="0" distB="0" distL="0" distR="0" wp14:anchorId="688F29A8" wp14:editId="573E01F9">
+            <wp:extent cx="5580000" cy="2483954"/>
+            <wp:effectExtent l="0" t="0" r="0" b="0"/>
+            <wp:docPr id="1" name="Picture 1"/>
+            <wp:cNvGraphicFramePr>
+              <a:graphicFrameLocks xmlns:a="http://schemas.openxmlformats.org/drawingml/2006/main" noChangeAspect="1"/>
+            </wp:cNvGraphicFramePr>
+            <a:graphic xmlns:a="http://schemas.openxmlformats.org/drawingml/2006/main">
+              <a:graphicData uri="http://schemas.openxmlformats.org/drawingml/2006/picture">
+                <pic:pic xmlns:pic="http://schemas.openxmlformats.org/drawingml/2006/picture">
+                  <pic:nvPicPr>
+                    <pic:cNvPr id="0" name="28_dashboard_encargado.jpg"/>
+                    <pic:cNvPicPr/>
+                  </pic:nvPicPr>
+                  <pic:blipFill>
+                    <a:blip r:embed="rId8"/>
+                    <a:stretch>
+                      <a:fillRect/>
+                    </a:stretch>
+                  </pic:blipFill>
+                  <pic:spPr>
+                    <a:xfrm>
+                      <a:off x="0" y="0"/>
+                      <a:ext cx="5580000" cy="2483954"/>
+                    </a:xfrm>
+                    <a:prstGeom prst="rect">
+                      <a:avLst/>
+                    </a:prstGeom>
+                  </pic:spPr>
+                </pic:pic>
+              </a:graphicData>
+            </a:graphic>
+          </wp:inline>
+        </w:drawing>
+      </w:r>
+    </w:p>
+    <w:p>
+      <w:pPr>
+        <w:jc w:val="center"/>
+      </w:pPr>
+      <w:r>
+        <w:rPr>
+          <w:i/>
+          <w:color w:val="595959"/>
+          <w:sz w:val="18"/>
+        </w:rPr>
+        <w:t>Dashboard de un encargado: solo su sucursal y menú reducido</w:t>
+      </w:r>
+    </w:p>
+    <w:p>
+      <w:pPr>
+        <w:jc w:val="center"/>
+      </w:pPr>
+      <w:r>
+        <w:rPr>
+          <w:noProof/>
+        </w:rPr>
+        <w:drawing>
+          <wp:inline distT="0" distB="0" distL="0" distR="0" wp14:anchorId="00DE9589" wp14:editId="761B67B5">
+            <wp:extent cx="5580000" cy="2483954"/>
+            <wp:effectExtent l="0" t="0" r="0" b="0"/>
+            <wp:docPr id="2" name="Picture 2"/>
+            <wp:cNvGraphicFramePr>
+              <a:graphicFrameLocks xmlns:a="http://schemas.openxmlformats.org/drawingml/2006/main" noChangeAspect="1"/>
+            </wp:cNvGraphicFramePr>
+            <a:graphic xmlns:a="http://schemas.openxmlformats.org/drawingml/2006/main">
+              <a:graphicData uri="http://schemas.openxmlformats.org/drawingml/2006/picture">
+                <pic:pic xmlns:pic="http://schemas.openxmlformats.org/drawingml/2006/picture">
+                  <pic:nvPicPr>
+                    <pic:cNvPr id="0" name="29_acceso_denegado.jpg"/>
+                    <pic:cNvPicPr/>
+                  </pic:nvPicPr>
+                  <pic:blipFill>
+                    <a:blip r:embed="rId9"/>
+                    <a:stretch>
+                      <a:fillRect/>
+                    </a:stretch>
+                  </pic:blipFill>
+                  <pic:spPr>
+                    <a:xfrm>
+                      <a:off x="0" y="0"/>
+                      <a:ext cx="5580000" cy="2483954"/>
+                    </a:xfrm>
+                    <a:prstGeom prst="rect">
+                      <a:avLst/>
+                    </a:prstGeom>
+                  </pic:spPr>
+                </pic:pic>
+              </a:graphicData>
+            </a:graphic>
+          </wp:inline>
+        </w:drawing>
+      </w:r>
+    </w:p>
+    <w:p>
+      <w:pPr>
+        <w:jc w:val="center"/>
+      </w:pPr>
+      <w:r>
+        <w:rPr>
+          <w:i/>
+          <w:color w:val="595959"/>
+          <w:sz w:val="18"/>
+        </w:rPr>
+        <w:t>Pantalla de acceso denegado</w:t>
+      </w:r>
+    </w:p>
+    <w:p>
+      <w:pPr>
         <w:pStyle w:val="Ttulo2"/>
       </w:pPr>
-      <w:bookmarkStart w:id="12" w:name="_Toc243776934"/>
+      <w:bookmarkStart w:id="12" w:name="_Toc243779765"/>
       <w:r>
         <w:t>3. Pantallas</w:t>
       </w:r>
@@ -8011,7 +8127,7 @@
       <w:pPr>
         <w:pStyle w:val="Ttulo3"/>
       </w:pPr>
-      <w:bookmarkStart w:id="13" w:name="_Toc243776935"/>
+      <w:bookmarkStart w:id="13" w:name="_Toc243779766"/>
       <w:r>
         <w:t>3.1 Ingreso al sistema</w:t>
       </w:r>
@@ -8039,8 +8155,6 @@
       </w:r>
       <w:r>
         <w:tab/>
-      </w:r>
-      <w:r>
         <w:t xml:space="preserve">Escriba su </w:t>
       </w:r>
       <w:r>
@@ -8104,6 +8218,64 @@
       </w:r>
       <w:r>
         <w:t>.</w:t>
+      </w:r>
+    </w:p>
+    <w:p>
+      <w:pPr>
+        <w:jc w:val="center"/>
+      </w:pPr>
+      <w:r>
+        <w:rPr>
+          <w:noProof/>
+        </w:rPr>
+        <w:drawing>
+          <wp:inline distT="0" distB="0" distL="0" distR="0" wp14:anchorId="14667AC7" wp14:editId="3A80D23A">
+            <wp:extent cx="5580000" cy="2647653"/>
+            <wp:effectExtent l="0" t="0" r="0" b="0"/>
+            <wp:docPr id="3" name="Picture 3"/>
+            <wp:cNvGraphicFramePr>
+              <a:graphicFrameLocks xmlns:a="http://schemas.openxmlformats.org/drawingml/2006/main" noChangeAspect="1"/>
+            </wp:cNvGraphicFramePr>
+            <a:graphic xmlns:a="http://schemas.openxmlformats.org/drawingml/2006/main">
+              <a:graphicData uri="http://schemas.openxmlformats.org/drawingml/2006/picture">
+                <pic:pic xmlns:pic="http://schemas.openxmlformats.org/drawingml/2006/picture">
+                  <pic:nvPicPr>
+                    <pic:cNvPr id="0" name="01_login.jpg"/>
+                    <pic:cNvPicPr/>
+                  </pic:nvPicPr>
+                  <pic:blipFill>
+                    <a:blip r:embed="rId10"/>
+                    <a:stretch>
+                      <a:fillRect/>
+                    </a:stretch>
+                  </pic:blipFill>
+                  <pic:spPr>
+                    <a:xfrm>
+                      <a:off x="0" y="0"/>
+                      <a:ext cx="5580000" cy="2647653"/>
+                    </a:xfrm>
+                    <a:prstGeom prst="rect">
+                      <a:avLst/>
+                    </a:prstGeom>
+                  </pic:spPr>
+                </pic:pic>
+              </a:graphicData>
+            </a:graphic>
+          </wp:inline>
+        </w:drawing>
+      </w:r>
+    </w:p>
+    <w:p>
+      <w:pPr>
+        <w:jc w:val="center"/>
+      </w:pPr>
+      <w:r>
+        <w:rPr>
+          <w:i/>
+          <w:color w:val="595959"/>
+          <w:sz w:val="18"/>
+        </w:rPr>
+        <w:t>Pantalla de ingreso</w:t>
       </w:r>
     </w:p>
     <w:p>
@@ -8125,7 +8297,7 @@
       <w:pPr>
         <w:pStyle w:val="Ttulo3"/>
       </w:pPr>
-      <w:bookmarkStart w:id="14" w:name="_Toc243776936"/>
+      <w:bookmarkStart w:id="14" w:name="_Toc243779767"/>
       <w:r>
         <w:t>3.2 Inicio (dashboard)</w:t>
       </w:r>
@@ -8228,6 +8400,64 @@
       </w:r>
     </w:p>
     <w:p>
+      <w:pPr>
+        <w:jc w:val="center"/>
+      </w:pPr>
+      <w:r>
+        <w:rPr>
+          <w:noProof/>
+        </w:rPr>
+        <w:drawing>
+          <wp:inline distT="0" distB="0" distL="0" distR="0" wp14:anchorId="7B0DBBCE" wp14:editId="58EACBA4">
+            <wp:extent cx="5580000" cy="2483954"/>
+            <wp:effectExtent l="0" t="0" r="0" b="0"/>
+            <wp:docPr id="4" name="Picture 4"/>
+            <wp:cNvGraphicFramePr>
+              <a:graphicFrameLocks xmlns:a="http://schemas.openxmlformats.org/drawingml/2006/main" noChangeAspect="1"/>
+            </wp:cNvGraphicFramePr>
+            <a:graphic xmlns:a="http://schemas.openxmlformats.org/drawingml/2006/main">
+              <a:graphicData uri="http://schemas.openxmlformats.org/drawingml/2006/picture">
+                <pic:pic xmlns:pic="http://schemas.openxmlformats.org/drawingml/2006/picture">
+                  <pic:nvPicPr>
+                    <pic:cNvPr id="0" name="02_dashboard_manaudi.jpg"/>
+                    <pic:cNvPicPr/>
+                  </pic:nvPicPr>
+                  <pic:blipFill>
+                    <a:blip r:embed="rId11"/>
+                    <a:stretch>
+                      <a:fillRect/>
+                    </a:stretch>
+                  </pic:blipFill>
+                  <pic:spPr>
+                    <a:xfrm>
+                      <a:off x="0" y="0"/>
+                      <a:ext cx="5580000" cy="2483954"/>
+                    </a:xfrm>
+                    <a:prstGeom prst="rect">
+                      <a:avLst/>
+                    </a:prstGeom>
+                  </pic:spPr>
+                </pic:pic>
+              </a:graphicData>
+            </a:graphic>
+          </wp:inline>
+        </w:drawing>
+      </w:r>
+    </w:p>
+    <w:p>
+      <w:pPr>
+        <w:jc w:val="center"/>
+      </w:pPr>
+      <w:r>
+        <w:rPr>
+          <w:i/>
+          <w:color w:val="595959"/>
+          <w:sz w:val="18"/>
+        </w:rPr>
+        <w:t>Dashboard de un usuario sin sucursal (toda la empresa)</w:t>
+      </w:r>
+    </w:p>
+    <w:p>
       <w:r>
         <w:t xml:space="preserve">Barra superior: nombre de la </w:t>
       </w:r>
@@ -8263,7 +8493,7 @@
       <w:pPr>
         <w:pStyle w:val="Ttulo3"/>
       </w:pPr>
-      <w:bookmarkStart w:id="15" w:name="_Toc243776937"/>
+      <w:bookmarkStart w:id="15" w:name="_Toc243779768"/>
       <w:r>
         <w:t>3.3 Manejo Empresas (rol Manaudi)</w:t>
       </w:r>
@@ -8384,6 +8614,64 @@
     </w:p>
     <w:p>
       <w:pPr>
+        <w:jc w:val="center"/>
+      </w:pPr>
+      <w:r>
+        <w:rPr>
+          <w:noProof/>
+        </w:rPr>
+        <w:drawing>
+          <wp:inline distT="0" distB="0" distL="0" distR="0" wp14:anchorId="42932B85" wp14:editId="22F95819">
+            <wp:extent cx="5580000" cy="2483954"/>
+            <wp:effectExtent l="0" t="0" r="0" b="0"/>
+            <wp:docPr id="5" name="Picture 5"/>
+            <wp:cNvGraphicFramePr>
+              <a:graphicFrameLocks xmlns:a="http://schemas.openxmlformats.org/drawingml/2006/main" noChangeAspect="1"/>
+            </wp:cNvGraphicFramePr>
+            <a:graphic xmlns:a="http://schemas.openxmlformats.org/drawingml/2006/main">
+              <a:graphicData uri="http://schemas.openxmlformats.org/drawingml/2006/picture">
+                <pic:pic xmlns:pic="http://schemas.openxmlformats.org/drawingml/2006/picture">
+                  <pic:nvPicPr>
+                    <pic:cNvPr id="0" name="03_empresas.jpg"/>
+                    <pic:cNvPicPr/>
+                  </pic:nvPicPr>
+                  <pic:blipFill>
+                    <a:blip r:embed="rId12"/>
+                    <a:stretch>
+                      <a:fillRect/>
+                    </a:stretch>
+                  </pic:blipFill>
+                  <pic:spPr>
+                    <a:xfrm>
+                      <a:off x="0" y="0"/>
+                      <a:ext cx="5580000" cy="2483954"/>
+                    </a:xfrm>
+                    <a:prstGeom prst="rect">
+                      <a:avLst/>
+                    </a:prstGeom>
+                  </pic:spPr>
+                </pic:pic>
+              </a:graphicData>
+            </a:graphic>
+          </wp:inline>
+        </w:drawing>
+      </w:r>
+    </w:p>
+    <w:p>
+      <w:pPr>
+        <w:jc w:val="center"/>
+      </w:pPr>
+      <w:r>
+        <w:rPr>
+          <w:i/>
+          <w:color w:val="595959"/>
+          <w:sz w:val="18"/>
+        </w:rPr>
+        <w:t>Manejo de empresas</w:t>
+      </w:r>
+    </w:p>
+    <w:p>
+      <w:pPr>
         <w:pStyle w:val="Ttulo4"/>
       </w:pPr>
       <w:r>
@@ -8427,9 +8715,67 @@
     </w:p>
     <w:p>
       <w:pPr>
+        <w:jc w:val="center"/>
+      </w:pPr>
+      <w:r>
+        <w:rPr>
+          <w:noProof/>
+        </w:rPr>
+        <w:drawing>
+          <wp:inline distT="0" distB="0" distL="0" distR="0" wp14:anchorId="52B57532" wp14:editId="165DEF42">
+            <wp:extent cx="5580000" cy="2483954"/>
+            <wp:effectExtent l="0" t="0" r="0" b="0"/>
+            <wp:docPr id="6" name="Picture 6"/>
+            <wp:cNvGraphicFramePr>
+              <a:graphicFrameLocks xmlns:a="http://schemas.openxmlformats.org/drawingml/2006/main" noChangeAspect="1"/>
+            </wp:cNvGraphicFramePr>
+            <a:graphic xmlns:a="http://schemas.openxmlformats.org/drawingml/2006/main">
+              <a:graphicData uri="http://schemas.openxmlformats.org/drawingml/2006/picture">
+                <pic:pic xmlns:pic="http://schemas.openxmlformats.org/drawingml/2006/picture">
+                  <pic:nvPicPr>
+                    <pic:cNvPr id="0" name="05_sucursales_lista.jpg"/>
+                    <pic:cNvPicPr/>
+                  </pic:nvPicPr>
+                  <pic:blipFill>
+                    <a:blip r:embed="rId13"/>
+                    <a:stretch>
+                      <a:fillRect/>
+                    </a:stretch>
+                  </pic:blipFill>
+                  <pic:spPr>
+                    <a:xfrm>
+                      <a:off x="0" y="0"/>
+                      <a:ext cx="5580000" cy="2483954"/>
+                    </a:xfrm>
+                    <a:prstGeom prst="rect">
+                      <a:avLst/>
+                    </a:prstGeom>
+                  </pic:spPr>
+                </pic:pic>
+              </a:graphicData>
+            </a:graphic>
+          </wp:inline>
+        </w:drawing>
+      </w:r>
+    </w:p>
+    <w:p>
+      <w:pPr>
+        <w:jc w:val="center"/>
+      </w:pPr>
+      <w:r>
+        <w:rPr>
+          <w:i/>
+          <w:color w:val="595959"/>
+          <w:sz w:val="18"/>
+        </w:rPr>
+        <w:t>Sucursales de una empresa con la nueva sucursal agregada</w:t>
+      </w:r>
+    </w:p>
+    <w:p>
+      <w:pPr>
         <w:pStyle w:val="Ttulo3"/>
       </w:pPr>
-      <w:bookmarkStart w:id="16" w:name="_Toc243776938"/>
+      <w:bookmarkStart w:id="16" w:name="_Toc243779769"/>
       <w:r>
         <w:t>3.4 Categorías (rol Supervisor; eliminar requiere Manaudi)</w:t>
       </w:r>
@@ -8556,9 +8902,183 @@
     </w:p>
     <w:p>
       <w:pPr>
+        <w:jc w:val="center"/>
+      </w:pPr>
+      <w:r>
+        <w:rPr>
+          <w:noProof/>
+        </w:rPr>
+        <w:drawing>
+          <wp:inline distT="0" distB="0" distL="0" distR="0" wp14:anchorId="2CB086A0" wp14:editId="0B298531">
+            <wp:extent cx="5580000" cy="2483954"/>
+            <wp:effectExtent l="0" t="0" r="0" b="0"/>
+            <wp:docPr id="7" name="Picture 7"/>
+            <wp:cNvGraphicFramePr>
+              <a:graphicFrameLocks xmlns:a="http://schemas.openxmlformats.org/drawingml/2006/main" noChangeAspect="1"/>
+            </wp:cNvGraphicFramePr>
+            <a:graphic xmlns:a="http://schemas.openxmlformats.org/drawingml/2006/main">
+              <a:graphicData uri="http://schemas.openxmlformats.org/drawingml/2006/picture">
+                <pic:pic xmlns:pic="http://schemas.openxmlformats.org/drawingml/2006/picture">
+                  <pic:nvPicPr>
+                    <pic:cNvPr id="0" name="06_categorias.jpg"/>
+                    <pic:cNvPicPr/>
+                  </pic:nvPicPr>
+                  <pic:blipFill>
+                    <a:blip r:embed="rId14"/>
+                    <a:stretch>
+                      <a:fillRect/>
+                    </a:stretch>
+                  </pic:blipFill>
+                  <pic:spPr>
+                    <a:xfrm>
+                      <a:off x="0" y="0"/>
+                      <a:ext cx="5580000" cy="2483954"/>
+                    </a:xfrm>
+                    <a:prstGeom prst="rect">
+                      <a:avLst/>
+                    </a:prstGeom>
+                  </pic:spPr>
+                </pic:pic>
+              </a:graphicData>
+            </a:graphic>
+          </wp:inline>
+        </w:drawing>
+      </w:r>
+    </w:p>
+    <w:p>
+      <w:pPr>
+        <w:jc w:val="center"/>
+      </w:pPr>
+      <w:r>
+        <w:rPr>
+          <w:i/>
+          <w:color w:val="595959"/>
+          <w:sz w:val="18"/>
+        </w:rPr>
+        <w:t>Lista de categorías</w:t>
+      </w:r>
+    </w:p>
+    <w:p>
+      <w:pPr>
+        <w:jc w:val="center"/>
+      </w:pPr>
+      <w:r>
+        <w:rPr>
+          <w:noProof/>
+        </w:rPr>
+        <w:drawing>
+          <wp:inline distT="0" distB="0" distL="0" distR="0" wp14:anchorId="52E74CD7" wp14:editId="0E7BBC1C">
+            <wp:extent cx="5580000" cy="2483954"/>
+            <wp:effectExtent l="0" t="0" r="0" b="0"/>
+            <wp:docPr id="8" name="Picture 8"/>
+            <wp:cNvGraphicFramePr>
+              <a:graphicFrameLocks xmlns:a="http://schemas.openxmlformats.org/drawingml/2006/main" noChangeAspect="1"/>
+            </wp:cNvGraphicFramePr>
+            <a:graphic xmlns:a="http://schemas.openxmlformats.org/drawingml/2006/main">
+              <a:graphicData uri="http://schemas.openxmlformats.org/drawingml/2006/picture">
+                <pic:pic xmlns:pic="http://schemas.openxmlformats.org/drawingml/2006/picture">
+                  <pic:nvPicPr>
+                    <pic:cNvPr id="0" name="08_clases.jpg"/>
+                    <pic:cNvPicPr/>
+                  </pic:nvPicPr>
+                  <pic:blipFill>
+                    <a:blip r:embed="rId15"/>
+                    <a:stretch>
+                      <a:fillRect/>
+                    </a:stretch>
+                  </pic:blipFill>
+                  <pic:spPr>
+                    <a:xfrm>
+                      <a:off x="0" y="0"/>
+                      <a:ext cx="5580000" cy="2483954"/>
+                    </a:xfrm>
+                    <a:prstGeom prst="rect">
+                      <a:avLst/>
+                    </a:prstGeom>
+                  </pic:spPr>
+                </pic:pic>
+              </a:graphicData>
+            </a:graphic>
+          </wp:inline>
+        </w:drawing>
+      </w:r>
+    </w:p>
+    <w:p>
+      <w:pPr>
+        <w:jc w:val="center"/>
+      </w:pPr>
+      <w:r>
+        <w:rPr>
+          <w:i/>
+          <w:color w:val="595959"/>
+          <w:sz w:val="18"/>
+        </w:rPr>
+        <w:t>Clases de una subcategoría</w:t>
+      </w:r>
+    </w:p>
+    <w:p>
+      <w:pPr>
+        <w:jc w:val="center"/>
+      </w:pPr>
+      <w:r>
+        <w:rPr>
+          <w:noProof/>
+        </w:rPr>
+        <w:drawing>
+          <wp:inline distT="0" distB="0" distL="0" distR="0" wp14:anchorId="3BEC3625" wp14:editId="6FE5F737">
+            <wp:extent cx="5580000" cy="2483954"/>
+            <wp:effectExtent l="0" t="0" r="0" b="0"/>
+            <wp:docPr id="9" name="Picture 9"/>
+            <wp:cNvGraphicFramePr>
+              <a:graphicFrameLocks xmlns:a="http://schemas.openxmlformats.org/drawingml/2006/main" noChangeAspect="1"/>
+            </wp:cNvGraphicFramePr>
+            <a:graphic xmlns:a="http://schemas.openxmlformats.org/drawingml/2006/main">
+              <a:graphicData uri="http://schemas.openxmlformats.org/drawingml/2006/picture">
+                <pic:pic xmlns:pic="http://schemas.openxmlformats.org/drawingml/2006/picture">
+                  <pic:nvPicPr>
+                    <pic:cNvPr id="0" name="09_clases_modal_crear.jpg"/>
+                    <pic:cNvPicPr/>
+                  </pic:nvPicPr>
+                  <pic:blipFill>
+                    <a:blip r:embed="rId16"/>
+                    <a:stretch>
+                      <a:fillRect/>
+                    </a:stretch>
+                  </pic:blipFill>
+                  <pic:spPr>
+                    <a:xfrm>
+                      <a:off x="0" y="0"/>
+                      <a:ext cx="5580000" cy="2483954"/>
+                    </a:xfrm>
+                    <a:prstGeom prst="rect">
+                      <a:avLst/>
+                    </a:prstGeom>
+                  </pic:spPr>
+                </pic:pic>
+              </a:graphicData>
+            </a:graphic>
+          </wp:inline>
+        </w:drawing>
+      </w:r>
+    </w:p>
+    <w:p>
+      <w:pPr>
+        <w:jc w:val="center"/>
+      </w:pPr>
+      <w:r>
+        <w:rPr>
+          <w:i/>
+          <w:color w:val="595959"/>
+          <w:sz w:val="18"/>
+        </w:rPr>
+        <w:t>Ventana para crear una clase</w:t>
+      </w:r>
+    </w:p>
+    <w:p>
+      <w:pPr>
         <w:pStyle w:val="Ttulo3"/>
       </w:pPr>
-      <w:bookmarkStart w:id="17" w:name="_Toc243776939"/>
+      <w:bookmarkStart w:id="17" w:name="_Toc243779770"/>
       <w:r>
         <w:t>3.5 Productos</w:t>
       </w:r>
@@ -9185,127 +9705,406 @@
       </w:r>
     </w:p>
     <w:p>
-      <w:pPr>
-        <w:pStyle w:val="Ttulo4"/>
-      </w:pPr>
-      <w:r>
-        <w:t xml:space="preserve">Lista Productos (Auditor, Supervisor, Manaudi) — </w:t>
+      <w:r>
+        <w:t>Detalles del formulario:</w:t>
+      </w:r>
+    </w:p>
+    <w:p>
+      <w:pPr>
+        <w:pStyle w:val="Listaconvietas"/>
+      </w:pPr>
+      <w:r>
+        <w:t xml:space="preserve">El </w:t>
+      </w:r>
+      <w:r>
+        <w:rPr>
+          <w:b/>
+        </w:rPr>
+        <w:t>código</w:t>
+      </w:r>
+      <w:r>
+        <w:t xml:space="preserve"> admite solo letras, números y guiones; otros caracteres (como </w:t>
       </w:r>
       <w:r>
         <w:rPr>
           <w:rFonts w:ascii="Consolas" w:eastAsia="Consolas" w:hAnsi="Consolas"/>
           <w:color w:val="C0392B"/>
         </w:rPr>
-        <w:t>/productos/lista_productos/</w:t>
-      </w:r>
-    </w:p>
-    <w:p>
-      <w:r>
-        <w:t xml:space="preserve">Tabla completa de la empresa con búsqueda, ordenamiento y paginación. Botones para </w:t>
+        <w:t>_</w:t>
+      </w:r>
+      <w:r>
+        <w:t>) se eliminan al escribir.</w:t>
+      </w:r>
+    </w:p>
+    <w:p>
+      <w:pPr>
+        <w:pStyle w:val="Listaconvietas"/>
+      </w:pPr>
+      <w:r>
+        <w:t xml:space="preserve">El </w:t>
       </w:r>
       <w:r>
         <w:rPr>
           <w:b/>
         </w:rPr>
-        <w:t>copiar, exportar a CSV / Excel / PDF e imprimir</w:t>
-      </w:r>
-      <w:r>
-        <w:t xml:space="preserve">. Los supervisores ven además el botón de </w:t>
-      </w:r>
-      <w:r>
-        <w:rPr>
-          <w:b/>
-        </w:rPr>
-        <w:t>editar</w:t>
-      </w:r>
-      <w:r>
-        <w:t xml:space="preserve"> en cada fila.</w:t>
-      </w:r>
-    </w:p>
-    <w:p>
-      <w:pPr>
-        <w:pStyle w:val="Ttulo4"/>
-      </w:pPr>
-      <w:r>
-        <w:t xml:space="preserve">Búsqueda Productos (Encargado y superiores) — </w:t>
+        <w:t>precio</w:t>
+      </w:r>
+      <w:r>
+        <w:t xml:space="preserve"> se escribe con sus decimales (por ejemplo </w:t>
       </w:r>
       <w:r>
         <w:rPr>
           <w:rFonts w:ascii="Consolas" w:eastAsia="Consolas" w:hAnsi="Consolas"/>
           <w:color w:val="C0392B"/>
         </w:rPr>
-        <w:t>/productos/busqueda/</w:t>
-      </w:r>
-    </w:p>
-    <w:p>
-      <w:r>
-        <w:t xml:space="preserve">Escriba parte del código, código auxiliar, EAN, modelo, nombre o descripción y/o elija una categoría; pulse </w:t>
-      </w:r>
-      <w:r>
-        <w:rPr>
-          <w:b/>
-        </w:rPr>
-        <w:t>Buscar</w:t>
-      </w:r>
-      <w:r>
-        <w:t>. Sin filtros no se muestran resultados. En cada resultado, según el rol:</w:t>
-      </w:r>
-    </w:p>
-    <w:p>
-      <w:pPr>
-        <w:pStyle w:val="Listaconvietas"/>
-      </w:pPr>
-      <w:r>
-        <w:t xml:space="preserve">Editar </w:t>
-      </w:r>
-      <w:r>
-        <w:rPr>
-          <w:b/>
-        </w:rPr>
-        <w:t>Editar</w:t>
-      </w:r>
-      <w:r>
-        <w:t xml:space="preserve"> (Supervisor).</w:t>
-      </w:r>
-    </w:p>
-    <w:p>
-      <w:pPr>
-        <w:pStyle w:val="Listaconvietas"/>
-      </w:pPr>
-      <w:r>
-        <w:t xml:space="preserve">Desactivar </w:t>
-      </w:r>
-      <w:r>
-        <w:rPr>
-          <w:b/>
-        </w:rPr>
-        <w:t>Desactivar</w:t>
-      </w:r>
-      <w:r>
-        <w:t xml:space="preserve"> / ✓ </w:t>
-      </w:r>
-      <w:r>
-        <w:rPr>
-          <w:b/>
-        </w:rPr>
-        <w:t>Activar</w:t>
-      </w:r>
-      <w:r>
-        <w:t xml:space="preserve"> (Manaudi). Pide confirmación. Un producto inactivo se muestra en gris; sigue apareciendo en listas y selectores (con su estado), pero indica que ya no se comercializa.</w:t>
-      </w:r>
-    </w:p>
-    <w:p>
-      <w:pPr>
-        <w:pStyle w:val="Ttulo4"/>
-      </w:pPr>
-      <w:r>
-        <w:t xml:space="preserve">Editar Producto (Supervisor) — </w:t>
+        <w:t>450.00</w:t>
+      </w:r>
+      <w:r>
+        <w:t xml:space="preserve">). Si se teclean solo dígitos, el campo los interpreta como centavos: </w:t>
       </w:r>
       <w:r>
         <w:rPr>
           <w:rFonts w:ascii="Consolas" w:eastAsia="Consolas" w:hAnsi="Consolas"/>
           <w:color w:val="C0392B"/>
         </w:rPr>
+        <w:t>450</w:t>
+      </w:r>
+      <w:r>
+        <w:t xml:space="preserve"> se convierte en </w:t>
+      </w:r>
+      <w:r>
+        <w:rPr>
+          <w:rFonts w:ascii="Consolas" w:eastAsia="Consolas" w:hAnsi="Consolas"/>
+          <w:color w:val="C0392B"/>
+        </w:rPr>
+        <w:t>4.50</w:t>
+      </w:r>
+      <w:r>
+        <w:t>.</w:t>
+      </w:r>
+    </w:p>
+    <w:p>
+      <w:pPr>
+        <w:pStyle w:val="Listaconvietas"/>
+      </w:pPr>
+      <w:r>
+        <w:t xml:space="preserve">El </w:t>
+      </w:r>
+      <w:r>
+        <w:rPr>
+          <w:b/>
+        </w:rPr>
+        <w:t>código EAN-13</w:t>
+      </w:r>
+      <w:r>
+        <w:t xml:space="preserve"> se valida con su dígito verificador; si no es válido aparece un aviso en rojo (el sistema igual permite guardar, pero conviene corregirlo).</w:t>
+      </w:r>
+    </w:p>
+    <w:p>
+      <w:pPr>
+        <w:jc w:val="center"/>
+      </w:pPr>
+      <w:r>
+        <w:rPr>
+          <w:noProof/>
+        </w:rPr>
+        <w:drawing>
+          <wp:inline distT="0" distB="0" distL="0" distR="0" wp14:anchorId="6449E7A6" wp14:editId="0248B016">
+            <wp:extent cx="5580000" cy="2483954"/>
+            <wp:effectExtent l="0" t="0" r="0" b="0"/>
+            <wp:docPr id="10" name="Picture 10"/>
+            <wp:cNvGraphicFramePr>
+              <a:graphicFrameLocks xmlns:a="http://schemas.openxmlformats.org/drawingml/2006/main" noChangeAspect="1"/>
+            </wp:cNvGraphicFramePr>
+            <a:graphic xmlns:a="http://schemas.openxmlformats.org/drawingml/2006/main">
+              <a:graphicData uri="http://schemas.openxmlformats.org/drawingml/2006/picture">
+                <pic:pic xmlns:pic="http://schemas.openxmlformats.org/drawingml/2006/picture">
+                  <pic:nvPicPr>
+                    <pic:cNvPr id="0" name="16_nuevo_producto_lleno.jpg"/>
+                    <pic:cNvPicPr/>
+                  </pic:nvPicPr>
+                  <pic:blipFill>
+                    <a:blip r:embed="rId17"/>
+                    <a:stretch>
+                      <a:fillRect/>
+                    </a:stretch>
+                  </pic:blipFill>
+                  <pic:spPr>
+                    <a:xfrm>
+                      <a:off x="0" y="0"/>
+                      <a:ext cx="5580000" cy="2483954"/>
+                    </a:xfrm>
+                    <a:prstGeom prst="rect">
+                      <a:avLst/>
+                    </a:prstGeom>
+                  </pic:spPr>
+                </pic:pic>
+              </a:graphicData>
+            </a:graphic>
+          </wp:inline>
+        </w:drawing>
+      </w:r>
+    </w:p>
+    <w:p>
+      <w:pPr>
+        <w:jc w:val="center"/>
+      </w:pPr>
+      <w:r>
+        <w:rPr>
+          <w:i/>
+          <w:color w:val="595959"/>
+          <w:sz w:val="18"/>
+        </w:rPr>
+        <w:t>Formulario de nuevo producto completo</w:t>
+      </w:r>
+    </w:p>
+    <w:p>
+      <w:pPr>
+        <w:pStyle w:val="Ttulo4"/>
+      </w:pPr>
+      <w:r>
+        <w:t xml:space="preserve">Lista Productos (Auditor, Supervisor, Manaudi) — </w:t>
+      </w:r>
+      <w:r>
+        <w:rPr>
+          <w:rFonts w:ascii="Consolas" w:eastAsia="Consolas" w:hAnsi="Consolas"/>
+          <w:color w:val="C0392B"/>
+        </w:rPr>
+        <w:t>/productos/lista_productos/</w:t>
+      </w:r>
+    </w:p>
+    <w:p>
+      <w:r>
+        <w:t xml:space="preserve">Tabla completa de la empresa con búsqueda, ordenamiento y paginación. Botones para </w:t>
+      </w:r>
+      <w:r>
+        <w:rPr>
+          <w:b/>
+        </w:rPr>
+        <w:t>copiar, exportar a CSV / Excel / PDF e imprimir</w:t>
+      </w:r>
+      <w:r>
+        <w:t xml:space="preserve">. Los supervisores ven además el botón de </w:t>
+      </w:r>
+      <w:r>
+        <w:rPr>
+          <w:b/>
+        </w:rPr>
+        <w:t>editar</w:t>
+      </w:r>
+      <w:r>
+        <w:t xml:space="preserve"> en cada fila y el acceso a </w:t>
+      </w:r>
+      <w:r>
+        <w:rPr>
+          <w:b/>
+        </w:rPr>
+        <w:t>Nuevo Producto</w:t>
+      </w:r>
+      <w:r>
+        <w:t>.</w:t>
+      </w:r>
+    </w:p>
+    <w:p>
+      <w:pPr>
+        <w:jc w:val="center"/>
+      </w:pPr>
+      <w:r>
+        <w:rPr>
+          <w:noProof/>
+        </w:rPr>
+        <w:drawing>
+          <wp:inline distT="0" distB="0" distL="0" distR="0" wp14:anchorId="3997FB3B" wp14:editId="168DEBF7">
+            <wp:extent cx="5580000" cy="2483954"/>
+            <wp:effectExtent l="0" t="0" r="0" b="0"/>
+            <wp:docPr id="11" name="Picture 11"/>
+            <wp:cNvGraphicFramePr>
+              <a:graphicFrameLocks xmlns:a="http://schemas.openxmlformats.org/drawingml/2006/main" noChangeAspect="1"/>
+            </wp:cNvGraphicFramePr>
+            <a:graphic xmlns:a="http://schemas.openxmlformats.org/drawingml/2006/main">
+              <a:graphicData uri="http://schemas.openxmlformats.org/drawingml/2006/picture">
+                <pic:pic xmlns:pic="http://schemas.openxmlformats.org/drawingml/2006/picture">
+                  <pic:nvPicPr>
+                    <pic:cNvPr id="0" name="17_lista_productos_supervisor.jpg"/>
+                    <pic:cNvPicPr/>
+                  </pic:nvPicPr>
+                  <pic:blipFill>
+                    <a:blip r:embed="rId18"/>
+                    <a:stretch>
+                      <a:fillRect/>
+                    </a:stretch>
+                  </pic:blipFill>
+                  <pic:spPr>
+                    <a:xfrm>
+                      <a:off x="0" y="0"/>
+                      <a:ext cx="5580000" cy="2483954"/>
+                    </a:xfrm>
+                    <a:prstGeom prst="rect">
+                      <a:avLst/>
+                    </a:prstGeom>
+                  </pic:spPr>
+                </pic:pic>
+              </a:graphicData>
+            </a:graphic>
+          </wp:inline>
+        </w:drawing>
+      </w:r>
+    </w:p>
+    <w:p>
+      <w:pPr>
+        <w:jc w:val="center"/>
+      </w:pPr>
+      <w:r>
+        <w:rPr>
+          <w:i/>
+          <w:color w:val="595959"/>
+          <w:sz w:val="18"/>
+        </w:rPr>
+        <w:t>Lista de productos vista por un supervisor</w:t>
+      </w:r>
+    </w:p>
+    <w:p>
+      <w:pPr>
+        <w:pStyle w:val="Ttulo4"/>
+      </w:pPr>
+      <w:r>
+        <w:t xml:space="preserve">Búsqueda Productos (Encargado y superiores) — </w:t>
+      </w:r>
+      <w:r>
+        <w:rPr>
+          <w:rFonts w:ascii="Consolas" w:eastAsia="Consolas" w:hAnsi="Consolas"/>
+          <w:color w:val="C0392B"/>
+        </w:rPr>
+        <w:t>/productos/busqueda/</w:t>
+      </w:r>
+    </w:p>
+    <w:p>
+      <w:r>
+        <w:t xml:space="preserve">Escriba parte del código, código auxiliar, EAN, modelo, nombre o descripción y/o elija una categoría; pulse </w:t>
+      </w:r>
+      <w:r>
+        <w:rPr>
+          <w:b/>
+        </w:rPr>
+        <w:t>Buscar</w:t>
+      </w:r>
+      <w:r>
+        <w:t>. Sin filtros no se muestran resultados. En cada resultado, según el rol:</w:t>
+      </w:r>
+    </w:p>
+    <w:p>
+      <w:pPr>
+        <w:pStyle w:val="Listaconvietas"/>
+      </w:pPr>
+      <w:r>
+        <w:t xml:space="preserve">Editar </w:t>
+      </w:r>
+      <w:r>
+        <w:rPr>
+          <w:b/>
+        </w:rPr>
+        <w:t>Editar</w:t>
+      </w:r>
+      <w:r>
+        <w:t xml:space="preserve"> (Supervisor).</w:t>
+      </w:r>
+    </w:p>
+    <w:p>
+      <w:pPr>
+        <w:pStyle w:val="Listaconvietas"/>
+      </w:pPr>
+      <w:r>
+        <w:t xml:space="preserve">Desactivar </w:t>
+      </w:r>
+      <w:r>
+        <w:rPr>
+          <w:b/>
+        </w:rPr>
+        <w:t>Desactivar</w:t>
+      </w:r>
+      <w:r>
+        <w:t xml:space="preserve"> / ✓ </w:t>
+      </w:r>
+      <w:r>
+        <w:rPr>
+          <w:b/>
+        </w:rPr>
+        <w:t>Activar</w:t>
+      </w:r>
+      <w:r>
+        <w:t xml:space="preserve"> (Manaudi). Pide confirmación. Un producto inactivo se muestra en gris; sigue apareciendo en listas y selectores (con su estado), pero indica que ya no se comercializa.</w:t>
+      </w:r>
+    </w:p>
+    <w:p>
+      <w:pPr>
+        <w:jc w:val="center"/>
+      </w:pPr>
+      <w:r>
+        <w:rPr>
+          <w:noProof/>
+        </w:rPr>
+        <w:drawing>
+          <wp:inline distT="0" distB="0" distL="0" distR="0" wp14:anchorId="5DA231EE" wp14:editId="32625114">
+            <wp:extent cx="5580000" cy="2483954"/>
+            <wp:effectExtent l="0" t="0" r="0" b="0"/>
+            <wp:docPr id="12" name="Picture 12"/>
+            <wp:cNvGraphicFramePr>
+              <a:graphicFrameLocks xmlns:a="http://schemas.openxmlformats.org/drawingml/2006/main" noChangeAspect="1"/>
+            </wp:cNvGraphicFramePr>
+            <a:graphic xmlns:a="http://schemas.openxmlformats.org/drawingml/2006/main">
+              <a:graphicData uri="http://schemas.openxmlformats.org/drawingml/2006/picture">
+                <pic:pic xmlns:pic="http://schemas.openxmlformats.org/drawingml/2006/picture">
+                  <pic:nvPicPr>
+                    <pic:cNvPr id="0" name="13_busqueda_inactivo.jpg"/>
+                    <pic:cNvPicPr/>
+                  </pic:nvPicPr>
+                  <pic:blipFill>
+                    <a:blip r:embed="rId19"/>
+                    <a:stretch>
+                      <a:fillRect/>
+                    </a:stretch>
+                  </pic:blipFill>
+                  <pic:spPr>
+                    <a:xfrm>
+                      <a:off x="0" y="0"/>
+                      <a:ext cx="5580000" cy="2483954"/>
+                    </a:xfrm>
+                    <a:prstGeom prst="rect">
+                      <a:avLst/>
+                    </a:prstGeom>
+                  </pic:spPr>
+                </pic:pic>
+              </a:graphicData>
+            </a:graphic>
+          </wp:inline>
+        </w:drawing>
+      </w:r>
+    </w:p>
+    <w:p>
+      <w:pPr>
+        <w:jc w:val="center"/>
+      </w:pPr>
+      <w:r>
+        <w:rPr>
+          <w:i/>
+          <w:color w:val="595959"/>
+          <w:sz w:val="18"/>
+        </w:rPr>
+        <w:t>Resultado de búsqueda con un producto inactivo y sus acciones (Manaudi)</w:t>
+      </w:r>
+    </w:p>
+    <w:p>
+      <w:pPr>
+        <w:pStyle w:val="Ttulo4"/>
+      </w:pPr>
+      <w:r>
+        <w:t xml:space="preserve">Editar Producto (Supervisor) — </w:t>
+      </w:r>
+      <w:r>
+        <w:rPr>
+          <w:rFonts w:ascii="Consolas" w:eastAsia="Consolas" w:hAnsi="Consolas"/>
+          <w:color w:val="C0392B"/>
+        </w:rPr>
         <w:t>/productos/editar/&lt;id&gt;/</w:t>
       </w:r>
     </w:p>
@@ -9318,7 +10117,7 @@
       <w:pPr>
         <w:pStyle w:val="Ttulo3"/>
       </w:pPr>
-      <w:bookmarkStart w:id="18" w:name="_Toc243776940"/>
+      <w:bookmarkStart w:id="18" w:name="_Toc243779771"/>
       <w:r>
         <w:t>3.6 Mantenimiento Inventario (rol Encargado y superiores)</w:t>
       </w:r>
@@ -9600,6 +10399,122 @@
     </w:p>
     <w:p>
       <w:pPr>
+        <w:jc w:val="center"/>
+      </w:pPr>
+      <w:r>
+        <w:rPr>
+          <w:noProof/>
+        </w:rPr>
+        <w:drawing>
+          <wp:inline distT="0" distB="0" distL="0" distR="0" wp14:anchorId="00CD2909" wp14:editId="59ABFDA8">
+            <wp:extent cx="5580000" cy="2483954"/>
+            <wp:effectExtent l="0" t="0" r="0" b="0"/>
+            <wp:docPr id="13" name="Picture 13"/>
+            <wp:cNvGraphicFramePr>
+              <a:graphicFrameLocks xmlns:a="http://schemas.openxmlformats.org/drawingml/2006/main" noChangeAspect="1"/>
+            </wp:cNvGraphicFramePr>
+            <a:graphic xmlns:a="http://schemas.openxmlformats.org/drawingml/2006/main">
+              <a:graphicData uri="http://schemas.openxmlformats.org/drawingml/2006/picture">
+                <pic:pic xmlns:pic="http://schemas.openxmlformats.org/drawingml/2006/picture">
+                  <pic:nvPicPr>
+                    <pic:cNvPr id="0" name="19_movimiento_entrada.jpg"/>
+                    <pic:cNvPicPr/>
+                  </pic:nvPicPr>
+                  <pic:blipFill>
+                    <a:blip r:embed="rId20"/>
+                    <a:stretch>
+                      <a:fillRect/>
+                    </a:stretch>
+                  </pic:blipFill>
+                  <pic:spPr>
+                    <a:xfrm>
+                      <a:off x="0" y="0"/>
+                      <a:ext cx="5580000" cy="2483954"/>
+                    </a:xfrm>
+                    <a:prstGeom prst="rect">
+                      <a:avLst/>
+                    </a:prstGeom>
+                  </pic:spPr>
+                </pic:pic>
+              </a:graphicData>
+            </a:graphic>
+          </wp:inline>
+        </w:drawing>
+      </w:r>
+    </w:p>
+    <w:p>
+      <w:pPr>
+        <w:jc w:val="center"/>
+      </w:pPr>
+      <w:r>
+        <w:rPr>
+          <w:i/>
+          <w:color w:val="595959"/>
+          <w:sz w:val="18"/>
+        </w:rPr>
+        <w:t>Registro de una entrada</w:t>
+      </w:r>
+    </w:p>
+    <w:p>
+      <w:pPr>
+        <w:jc w:val="center"/>
+      </w:pPr>
+      <w:r>
+        <w:rPr>
+          <w:noProof/>
+        </w:rPr>
+        <w:drawing>
+          <wp:inline distT="0" distB="0" distL="0" distR="0" wp14:anchorId="362F097F" wp14:editId="458C2EEB">
+            <wp:extent cx="5580000" cy="2483954"/>
+            <wp:effectExtent l="0" t="0" r="0" b="0"/>
+            <wp:docPr id="14" name="Picture 14"/>
+            <wp:cNvGraphicFramePr>
+              <a:graphicFrameLocks xmlns:a="http://schemas.openxmlformats.org/drawingml/2006/main" noChangeAspect="1"/>
+            </wp:cNvGraphicFramePr>
+            <a:graphic xmlns:a="http://schemas.openxmlformats.org/drawingml/2006/main">
+              <a:graphicData uri="http://schemas.openxmlformats.org/drawingml/2006/picture">
+                <pic:pic xmlns:pic="http://schemas.openxmlformats.org/drawingml/2006/picture">
+                  <pic:nvPicPr>
+                    <pic:cNvPr id="0" name="21_movimiento_stock_insuficiente.jpg"/>
+                    <pic:cNvPicPr/>
+                  </pic:nvPicPr>
+                  <pic:blipFill>
+                    <a:blip r:embed="rId21"/>
+                    <a:stretch>
+                      <a:fillRect/>
+                    </a:stretch>
+                  </pic:blipFill>
+                  <pic:spPr>
+                    <a:xfrm>
+                      <a:off x="0" y="0"/>
+                      <a:ext cx="5580000" cy="2483954"/>
+                    </a:xfrm>
+                    <a:prstGeom prst="rect">
+                      <a:avLst/>
+                    </a:prstGeom>
+                  </pic:spPr>
+                </pic:pic>
+              </a:graphicData>
+            </a:graphic>
+          </wp:inline>
+        </w:drawing>
+      </w:r>
+    </w:p>
+    <w:p>
+      <w:pPr>
+        <w:jc w:val="center"/>
+      </w:pPr>
+      <w:r>
+        <w:rPr>
+          <w:i/>
+          <w:color w:val="595959"/>
+          <w:sz w:val="18"/>
+        </w:rPr>
+        <w:t>Salida rechazada por stock insuficiente</w:t>
+      </w:r>
+    </w:p>
+    <w:p>
+      <w:pPr>
         <w:pStyle w:val="Ttulo4"/>
       </w:pPr>
       <w:r>
@@ -9730,6 +10645,122 @@
     </w:p>
     <w:p>
       <w:pPr>
+        <w:jc w:val="center"/>
+      </w:pPr>
+      <w:r>
+        <w:rPr>
+          <w:noProof/>
+        </w:rPr>
+        <w:drawing>
+          <wp:inline distT="0" distB="0" distL="0" distR="0" wp14:anchorId="2DF0C8C9" wp14:editId="09539194">
+            <wp:extent cx="5580000" cy="2483954"/>
+            <wp:effectExtent l="0" t="0" r="0" b="0"/>
+            <wp:docPr id="15" name="Picture 15"/>
+            <wp:cNvGraphicFramePr>
+              <a:graphicFrameLocks xmlns:a="http://schemas.openxmlformats.org/drawingml/2006/main" noChangeAspect="1"/>
+            </wp:cNvGraphicFramePr>
+            <a:graphic xmlns:a="http://schemas.openxmlformats.org/drawingml/2006/main">
+              <a:graphicData uri="http://schemas.openxmlformats.org/drawingml/2006/picture">
+                <pic:pic xmlns:pic="http://schemas.openxmlformats.org/drawingml/2006/picture">
+                  <pic:nvPicPr>
+                    <pic:cNvPr id="0" name="22_traslado_formulario.jpg"/>
+                    <pic:cNvPicPr/>
+                  </pic:nvPicPr>
+                  <pic:blipFill>
+                    <a:blip r:embed="rId22"/>
+                    <a:stretch>
+                      <a:fillRect/>
+                    </a:stretch>
+                  </pic:blipFill>
+                  <pic:spPr>
+                    <a:xfrm>
+                      <a:off x="0" y="0"/>
+                      <a:ext cx="5580000" cy="2483954"/>
+                    </a:xfrm>
+                    <a:prstGeom prst="rect">
+                      <a:avLst/>
+                    </a:prstGeom>
+                  </pic:spPr>
+                </pic:pic>
+              </a:graphicData>
+            </a:graphic>
+          </wp:inline>
+        </w:drawing>
+      </w:r>
+    </w:p>
+    <w:p>
+      <w:pPr>
+        <w:jc w:val="center"/>
+      </w:pPr>
+      <w:r>
+        <w:rPr>
+          <w:i/>
+          <w:color w:val="595959"/>
+          <w:sz w:val="18"/>
+        </w:rPr>
+        <w:t>Formulario de traslado</w:t>
+      </w:r>
+    </w:p>
+    <w:p>
+      <w:pPr>
+        <w:jc w:val="center"/>
+      </w:pPr>
+      <w:r>
+        <w:rPr>
+          <w:noProof/>
+        </w:rPr>
+        <w:drawing>
+          <wp:inline distT="0" distB="0" distL="0" distR="0" wp14:anchorId="660483F9" wp14:editId="5647E3E9">
+            <wp:extent cx="5580000" cy="2483954"/>
+            <wp:effectExtent l="0" t="0" r="0" b="0"/>
+            <wp:docPr id="16" name="Picture 16"/>
+            <wp:cNvGraphicFramePr>
+              <a:graphicFrameLocks xmlns:a="http://schemas.openxmlformats.org/drawingml/2006/main" noChangeAspect="1"/>
+            </wp:cNvGraphicFramePr>
+            <a:graphic xmlns:a="http://schemas.openxmlformats.org/drawingml/2006/main">
+              <a:graphicData uri="http://schemas.openxmlformats.org/drawingml/2006/picture">
+                <pic:pic xmlns:pic="http://schemas.openxmlformats.org/drawingml/2006/picture">
+                  <pic:nvPicPr>
+                    <pic:cNvPr id="0" name="24_traslados_recientes.jpg"/>
+                    <pic:cNvPicPr/>
+                  </pic:nvPicPr>
+                  <pic:blipFill>
+                    <a:blip r:embed="rId23"/>
+                    <a:stretch>
+                      <a:fillRect/>
+                    </a:stretch>
+                  </pic:blipFill>
+                  <pic:spPr>
+                    <a:xfrm>
+                      <a:off x="0" y="0"/>
+                      <a:ext cx="5580000" cy="2483954"/>
+                    </a:xfrm>
+                    <a:prstGeom prst="rect">
+                      <a:avLst/>
+                    </a:prstGeom>
+                  </pic:spPr>
+                </pic:pic>
+              </a:graphicData>
+            </a:graphic>
+          </wp:inline>
+        </w:drawing>
+      </w:r>
+    </w:p>
+    <w:p>
+      <w:pPr>
+        <w:jc w:val="center"/>
+      </w:pPr>
+      <w:r>
+        <w:rPr>
+          <w:i/>
+          <w:color w:val="595959"/>
+          <w:sz w:val="18"/>
+        </w:rPr>
+        <w:t>Traslados recientes con su estado</w:t>
+      </w:r>
+    </w:p>
+    <w:p>
+      <w:pPr>
         <w:pStyle w:val="Ttulo4"/>
       </w:pPr>
       <w:r>
@@ -9847,6 +10878,122 @@
     </w:p>
     <w:p>
       <w:pPr>
+        <w:jc w:val="center"/>
+      </w:pPr>
+      <w:r>
+        <w:rPr>
+          <w:noProof/>
+        </w:rPr>
+        <w:drawing>
+          <wp:inline distT="0" distB="0" distL="0" distR="0" wp14:anchorId="1EFF5689" wp14:editId="44A78708">
+            <wp:extent cx="5580000" cy="2483954"/>
+            <wp:effectExtent l="0" t="0" r="0" b="0"/>
+            <wp:docPr id="17" name="Picture 17"/>
+            <wp:cNvGraphicFramePr>
+              <a:graphicFrameLocks xmlns:a="http://schemas.openxmlformats.org/drawingml/2006/main" noChangeAspect="1"/>
+            </wp:cNvGraphicFramePr>
+            <a:graphic xmlns:a="http://schemas.openxmlformats.org/drawingml/2006/main">
+              <a:graphicData uri="http://schemas.openxmlformats.org/drawingml/2006/picture">
+                <pic:pic xmlns:pic="http://schemas.openxmlformats.org/drawingml/2006/picture">
+                  <pic:nvPicPr>
+                    <pic:cNvPr id="0" name="30_acuse_recibo.jpg"/>
+                    <pic:cNvPicPr/>
+                  </pic:nvPicPr>
+                  <pic:blipFill>
+                    <a:blip r:embed="rId24"/>
+                    <a:stretch>
+                      <a:fillRect/>
+                    </a:stretch>
+                  </pic:blipFill>
+                  <pic:spPr>
+                    <a:xfrm>
+                      <a:off x="0" y="0"/>
+                      <a:ext cx="5580000" cy="2483954"/>
+                    </a:xfrm>
+                    <a:prstGeom prst="rect">
+                      <a:avLst/>
+                    </a:prstGeom>
+                  </pic:spPr>
+                </pic:pic>
+              </a:graphicData>
+            </a:graphic>
+          </wp:inline>
+        </w:drawing>
+      </w:r>
+    </w:p>
+    <w:p>
+      <w:pPr>
+        <w:jc w:val="center"/>
+      </w:pPr>
+      <w:r>
+        <w:rPr>
+          <w:i/>
+          <w:color w:val="595959"/>
+          <w:sz w:val="18"/>
+        </w:rPr>
+        <w:t>Acuse Recibo visto por el encargado de la sucursal destino</w:t>
+      </w:r>
+    </w:p>
+    <w:p>
+      <w:pPr>
+        <w:jc w:val="center"/>
+      </w:pPr>
+      <w:r>
+        <w:rPr>
+          <w:noProof/>
+        </w:rPr>
+        <w:drawing>
+          <wp:inline distT="0" distB="0" distL="0" distR="0" wp14:anchorId="69F41FC3" wp14:editId="55735E38">
+            <wp:extent cx="5580000" cy="2483954"/>
+            <wp:effectExtent l="0" t="0" r="0" b="0"/>
+            <wp:docPr id="18" name="Picture 18"/>
+            <wp:cNvGraphicFramePr>
+              <a:graphicFrameLocks xmlns:a="http://schemas.openxmlformats.org/drawingml/2006/main" noChangeAspect="1"/>
+            </wp:cNvGraphicFramePr>
+            <a:graphic xmlns:a="http://schemas.openxmlformats.org/drawingml/2006/main">
+              <a:graphicData uri="http://schemas.openxmlformats.org/drawingml/2006/picture">
+                <pic:pic xmlns:pic="http://schemas.openxmlformats.org/drawingml/2006/picture">
+                  <pic:nvPicPr>
+                    <pic:cNvPr id="0" name="31_confirmar_recepcion.jpg"/>
+                    <pic:cNvPicPr/>
+                  </pic:nvPicPr>
+                  <pic:blipFill>
+                    <a:blip r:embed="rId25"/>
+                    <a:stretch>
+                      <a:fillRect/>
+                    </a:stretch>
+                  </pic:blipFill>
+                  <pic:spPr>
+                    <a:xfrm>
+                      <a:off x="0" y="0"/>
+                      <a:ext cx="5580000" cy="2483954"/>
+                    </a:xfrm>
+                    <a:prstGeom prst="rect">
+                      <a:avLst/>
+                    </a:prstGeom>
+                  </pic:spPr>
+                </pic:pic>
+              </a:graphicData>
+            </a:graphic>
+          </wp:inline>
+        </w:drawing>
+      </w:r>
+    </w:p>
+    <w:p>
+      <w:pPr>
+        <w:jc w:val="center"/>
+      </w:pPr>
+      <w:r>
+        <w:rPr>
+          <w:i/>
+          <w:color w:val="595959"/>
+          <w:sz w:val="18"/>
+        </w:rPr>
+        <w:t>Confirmación de la cantidad recibida</w:t>
+      </w:r>
+    </w:p>
+    <w:p>
+      <w:pPr>
         <w:pStyle w:val="Ttulo4"/>
       </w:pPr>
       <w:r>
@@ -9936,9 +11083,125 @@
     </w:p>
     <w:p>
       <w:pPr>
+        <w:jc w:val="center"/>
+      </w:pPr>
+      <w:r>
+        <w:rPr>
+          <w:noProof/>
+        </w:rPr>
+        <w:drawing>
+          <wp:inline distT="0" distB="0" distL="0" distR="0" wp14:anchorId="45F27724" wp14:editId="01D17008">
+            <wp:extent cx="5580000" cy="2483954"/>
+            <wp:effectExtent l="0" t="0" r="0" b="0"/>
+            <wp:docPr id="19" name="Picture 19"/>
+            <wp:cNvGraphicFramePr>
+              <a:graphicFrameLocks xmlns:a="http://schemas.openxmlformats.org/drawingml/2006/main" noChangeAspect="1"/>
+            </wp:cNvGraphicFramePr>
+            <a:graphic xmlns:a="http://schemas.openxmlformats.org/drawingml/2006/main">
+              <a:graphicData uri="http://schemas.openxmlformats.org/drawingml/2006/picture">
+                <pic:pic xmlns:pic="http://schemas.openxmlformats.org/drawingml/2006/picture">
+                  <pic:nvPicPr>
+                    <pic:cNvPr id="0" name="25_movimientos_producto.jpg"/>
+                    <pic:cNvPicPr/>
+                  </pic:nvPicPr>
+                  <pic:blipFill>
+                    <a:blip r:embed="rId26"/>
+                    <a:stretch>
+                      <a:fillRect/>
+                    </a:stretch>
+                  </pic:blipFill>
+                  <pic:spPr>
+                    <a:xfrm>
+                      <a:off x="0" y="0"/>
+                      <a:ext cx="5580000" cy="2483954"/>
+                    </a:xfrm>
+                    <a:prstGeom prst="rect">
+                      <a:avLst/>
+                    </a:prstGeom>
+                  </pic:spPr>
+                </pic:pic>
+              </a:graphicData>
+            </a:graphic>
+          </wp:inline>
+        </w:drawing>
+      </w:r>
+    </w:p>
+    <w:p>
+      <w:pPr>
+        <w:jc w:val="center"/>
+      </w:pPr>
+      <w:r>
+        <w:rPr>
+          <w:i/>
+          <w:color w:val="595959"/>
+          <w:sz w:val="18"/>
+        </w:rPr>
+        <w:t>Movimientos por producto (kardex)</w:t>
+      </w:r>
+    </w:p>
+    <w:p>
+      <w:pPr>
+        <w:jc w:val="center"/>
+      </w:pPr>
+      <w:r>
+        <w:rPr>
+          <w:noProof/>
+        </w:rPr>
+        <w:drawing>
+          <wp:inline distT="0" distB="0" distL="0" distR="0" wp14:anchorId="5AC38F1D" wp14:editId="1B562BD3">
+            <wp:extent cx="5580000" cy="2483954"/>
+            <wp:effectExtent l="0" t="0" r="0" b="0"/>
+            <wp:docPr id="20" name="Picture 20"/>
+            <wp:cNvGraphicFramePr>
+              <a:graphicFrameLocks xmlns:a="http://schemas.openxmlformats.org/drawingml/2006/main" noChangeAspect="1"/>
+            </wp:cNvGraphicFramePr>
+            <a:graphic xmlns:a="http://schemas.openxmlformats.org/drawingml/2006/main">
+              <a:graphicData uri="http://schemas.openxmlformats.org/drawingml/2006/picture">
+                <pic:pic xmlns:pic="http://schemas.openxmlformats.org/drawingml/2006/picture">
+                  <pic:nvPicPr>
+                    <pic:cNvPr id="0" name="26_movimientos_empresa.jpg"/>
+                    <pic:cNvPicPr/>
+                  </pic:nvPicPr>
+                  <pic:blipFill>
+                    <a:blip r:embed="rId27"/>
+                    <a:stretch>
+                      <a:fillRect/>
+                    </a:stretch>
+                  </pic:blipFill>
+                  <pic:spPr>
+                    <a:xfrm>
+                      <a:off x="0" y="0"/>
+                      <a:ext cx="5580000" cy="2483954"/>
+                    </a:xfrm>
+                    <a:prstGeom prst="rect">
+                      <a:avLst/>
+                    </a:prstGeom>
+                  </pic:spPr>
+                </pic:pic>
+              </a:graphicData>
+            </a:graphic>
+          </wp:inline>
+        </w:drawing>
+      </w:r>
+    </w:p>
+    <w:p>
+      <w:pPr>
+        <w:jc w:val="center"/>
+      </w:pPr>
+      <w:r>
+        <w:rPr>
+          <w:i/>
+          <w:color w:val="595959"/>
+          <w:sz w:val="18"/>
+        </w:rPr>
+        <w:t>Movimientos por empresa</w:t>
+      </w:r>
+    </w:p>
+    <w:p>
+      <w:pPr>
         <w:pStyle w:val="Ttulo3"/>
       </w:pPr>
-      <w:bookmarkStart w:id="19" w:name="_Toc243776941"/>
+      <w:bookmarkStart w:id="19" w:name="_Toc243779772"/>
       <w:r>
         <w:t>3.7 Reportes (rol Auditor y superiores)</w:t>
       </w:r>
@@ -9989,6 +11252,64 @@
     </w:p>
     <w:p>
       <w:pPr>
+        <w:jc w:val="center"/>
+      </w:pPr>
+      <w:r>
+        <w:rPr>
+          <w:noProof/>
+        </w:rPr>
+        <w:drawing>
+          <wp:inline distT="0" distB="0" distL="0" distR="0" wp14:anchorId="53DBF16D" wp14:editId="37C9D025">
+            <wp:extent cx="5580000" cy="2483954"/>
+            <wp:effectExtent l="0" t="0" r="0" b="0"/>
+            <wp:docPr id="21" name="Picture 21"/>
+            <wp:cNvGraphicFramePr>
+              <a:graphicFrameLocks xmlns:a="http://schemas.openxmlformats.org/drawingml/2006/main" noChangeAspect="1"/>
+            </wp:cNvGraphicFramePr>
+            <a:graphic xmlns:a="http://schemas.openxmlformats.org/drawingml/2006/main">
+              <a:graphicData uri="http://schemas.openxmlformats.org/drawingml/2006/picture">
+                <pic:pic xmlns:pic="http://schemas.openxmlformats.org/drawingml/2006/picture">
+                  <pic:nvPicPr>
+                    <pic:cNvPr id="0" name="39_reporte_diario.jpg"/>
+                    <pic:cNvPicPr/>
+                  </pic:nvPicPr>
+                  <pic:blipFill>
+                    <a:blip r:embed="rId28"/>
+                    <a:stretch>
+                      <a:fillRect/>
+                    </a:stretch>
+                  </pic:blipFill>
+                  <pic:spPr>
+                    <a:xfrm>
+                      <a:off x="0" y="0"/>
+                      <a:ext cx="5580000" cy="2483954"/>
+                    </a:xfrm>
+                    <a:prstGeom prst="rect">
+                      <a:avLst/>
+                    </a:prstGeom>
+                  </pic:spPr>
+                </pic:pic>
+              </a:graphicData>
+            </a:graphic>
+          </wp:inline>
+        </w:drawing>
+      </w:r>
+    </w:p>
+    <w:p>
+      <w:pPr>
+        <w:jc w:val="center"/>
+      </w:pPr>
+      <w:r>
+        <w:rPr>
+          <w:i/>
+          <w:color w:val="595959"/>
+          <w:sz w:val="18"/>
+        </w:rPr>
+        <w:t>Reporte de movimientos del día</w:t>
+      </w:r>
+    </w:p>
+    <w:p>
+      <w:pPr>
         <w:pStyle w:val="Ttulo4"/>
       </w:pPr>
       <w:r>
@@ -10069,7 +11390,123 @@
         <w:t>Alertas</w:t>
       </w:r>
       <w:r>
-        <w:t>: productos con cantidad menor o igual al stock mínimo.</w:t>
+        <w:t>: productos con cantidad menor o igual al stock mínimo, con el déficit a reponer.</w:t>
+      </w:r>
+    </w:p>
+    <w:p>
+      <w:pPr>
+        <w:jc w:val="center"/>
+      </w:pPr>
+      <w:r>
+        <w:rPr>
+          <w:noProof/>
+        </w:rPr>
+        <w:drawing>
+          <wp:inline distT="0" distB="0" distL="0" distR="0" wp14:anchorId="5442E459" wp14:editId="253EFA0F">
+            <wp:extent cx="5580000" cy="2483954"/>
+            <wp:effectExtent l="0" t="0" r="0" b="0"/>
+            <wp:docPr id="22" name="Picture 22"/>
+            <wp:cNvGraphicFramePr>
+              <a:graphicFrameLocks xmlns:a="http://schemas.openxmlformats.org/drawingml/2006/main" noChangeAspect="1"/>
+            </wp:cNvGraphicFramePr>
+            <a:graphic xmlns:a="http://schemas.openxmlformats.org/drawingml/2006/main">
+              <a:graphicData uri="http://schemas.openxmlformats.org/drawingml/2006/picture">
+                <pic:pic xmlns:pic="http://schemas.openxmlformats.org/drawingml/2006/picture">
+                  <pic:nvPicPr>
+                    <pic:cNvPr id="0" name="41_valorizado_detalle.jpg"/>
+                    <pic:cNvPicPr/>
+                  </pic:nvPicPr>
+                  <pic:blipFill>
+                    <a:blip r:embed="rId29"/>
+                    <a:stretch>
+                      <a:fillRect/>
+                    </a:stretch>
+                  </pic:blipFill>
+                  <pic:spPr>
+                    <a:xfrm>
+                      <a:off x="0" y="0"/>
+                      <a:ext cx="5580000" cy="2483954"/>
+                    </a:xfrm>
+                    <a:prstGeom prst="rect">
+                      <a:avLst/>
+                    </a:prstGeom>
+                  </pic:spPr>
+                </pic:pic>
+              </a:graphicData>
+            </a:graphic>
+          </wp:inline>
+        </w:drawing>
+      </w:r>
+    </w:p>
+    <w:p>
+      <w:pPr>
+        <w:jc w:val="center"/>
+      </w:pPr>
+      <w:r>
+        <w:rPr>
+          <w:i/>
+          <w:color w:val="595959"/>
+          <w:sz w:val="18"/>
+        </w:rPr>
+        <w:t>Inventario valorizado: detalle</w:t>
+      </w:r>
+    </w:p>
+    <w:p>
+      <w:pPr>
+        <w:jc w:val="center"/>
+      </w:pPr>
+      <w:r>
+        <w:rPr>
+          <w:noProof/>
+        </w:rPr>
+        <w:drawing>
+          <wp:inline distT="0" distB="0" distL="0" distR="0" wp14:anchorId="7C0BCF1D" wp14:editId="6C15782E">
+            <wp:extent cx="5580000" cy="2483954"/>
+            <wp:effectExtent l="0" t="0" r="0" b="0"/>
+            <wp:docPr id="23" name="Picture 23"/>
+            <wp:cNvGraphicFramePr>
+              <a:graphicFrameLocks xmlns:a="http://schemas.openxmlformats.org/drawingml/2006/main" noChangeAspect="1"/>
+            </wp:cNvGraphicFramePr>
+            <a:graphic xmlns:a="http://schemas.openxmlformats.org/drawingml/2006/main">
+              <a:graphicData uri="http://schemas.openxmlformats.org/drawingml/2006/picture">
+                <pic:pic xmlns:pic="http://schemas.openxmlformats.org/drawingml/2006/picture">
+                  <pic:nvPicPr>
+                    <pic:cNvPr id="0" name="44_valorizado_alertas.jpg"/>
+                    <pic:cNvPicPr/>
+                  </pic:nvPicPr>
+                  <pic:blipFill>
+                    <a:blip r:embed="rId30"/>
+                    <a:stretch>
+                      <a:fillRect/>
+                    </a:stretch>
+                  </pic:blipFill>
+                  <pic:spPr>
+                    <a:xfrm>
+                      <a:off x="0" y="0"/>
+                      <a:ext cx="5580000" cy="2483954"/>
+                    </a:xfrm>
+                    <a:prstGeom prst="rect">
+                      <a:avLst/>
+                    </a:prstGeom>
+                  </pic:spPr>
+                </pic:pic>
+              </a:graphicData>
+            </a:graphic>
+          </wp:inline>
+        </w:drawing>
+      </w:r>
+    </w:p>
+    <w:p>
+      <w:pPr>
+        <w:jc w:val="center"/>
+      </w:pPr>
+      <w:r>
+        <w:rPr>
+          <w:i/>
+          <w:color w:val="595959"/>
+          <w:sz w:val="18"/>
+        </w:rPr>
+        <w:t>Alertas de stock bajo y agotado</w:t>
       </w:r>
     </w:p>
     <w:p>
@@ -10373,9 +11810,67 @@
     </w:p>
     <w:p>
       <w:pPr>
+        <w:jc w:val="center"/>
+      </w:pPr>
+      <w:r>
+        <w:rPr>
+          <w:noProof/>
+        </w:rPr>
+        <w:drawing>
+          <wp:inline distT="0" distB="0" distL="0" distR="0" wp14:anchorId="0EB0653D" wp14:editId="202897A0">
+            <wp:extent cx="5580000" cy="2483954"/>
+            <wp:effectExtent l="0" t="0" r="0" b="0"/>
+            <wp:docPr id="24" name="Picture 24"/>
+            <wp:cNvGraphicFramePr>
+              <a:graphicFrameLocks xmlns:a="http://schemas.openxmlformats.org/drawingml/2006/main" noChangeAspect="1"/>
+            </wp:cNvGraphicFramePr>
+            <a:graphic xmlns:a="http://schemas.openxmlformats.org/drawingml/2006/main">
+              <a:graphicData uri="http://schemas.openxmlformats.org/drawingml/2006/picture">
+                <pic:pic xmlns:pic="http://schemas.openxmlformats.org/drawingml/2006/picture">
+                  <pic:nvPicPr>
+                    <pic:cNvPr id="0" name="11_carga_masiva.jpg"/>
+                    <pic:cNvPicPr/>
+                  </pic:nvPicPr>
+                  <pic:blipFill>
+                    <a:blip r:embed="rId31"/>
+                    <a:stretch>
+                      <a:fillRect/>
+                    </a:stretch>
+                  </pic:blipFill>
+                  <pic:spPr>
+                    <a:xfrm>
+                      <a:off x="0" y="0"/>
+                      <a:ext cx="5580000" cy="2483954"/>
+                    </a:xfrm>
+                    <a:prstGeom prst="rect">
+                      <a:avLst/>
+                    </a:prstGeom>
+                  </pic:spPr>
+                </pic:pic>
+              </a:graphicData>
+            </a:graphic>
+          </wp:inline>
+        </w:drawing>
+      </w:r>
+    </w:p>
+    <w:p>
+      <w:pPr>
+        <w:jc w:val="center"/>
+      </w:pPr>
+      <w:r>
+        <w:rPr>
+          <w:i/>
+          <w:color w:val="595959"/>
+          <w:sz w:val="18"/>
+        </w:rPr>
+        <w:t>Carga masiva de productos</w:t>
+      </w:r>
+    </w:p>
+    <w:p>
+      <w:pPr>
         <w:pStyle w:val="Ttulo3"/>
       </w:pPr>
-      <w:bookmarkStart w:id="20" w:name="_Toc243776942"/>
+      <w:bookmarkStart w:id="20" w:name="_Toc243779773"/>
       <w:r>
         <w:t>3.8 Administrador del sistema (superusuario)</w:t>
       </w:r>
@@ -10481,9 +11976,183 @@
     </w:p>
     <w:p>
       <w:pPr>
+        <w:jc w:val="center"/>
+      </w:pPr>
+      <w:r>
+        <w:rPr>
+          <w:noProof/>
+        </w:rPr>
+        <w:drawing>
+          <wp:inline distT="0" distB="0" distL="0" distR="0" wp14:anchorId="504D8D05" wp14:editId="4A27E5FD">
+            <wp:extent cx="5580000" cy="2483954"/>
+            <wp:effectExtent l="0" t="0" r="0" b="0"/>
+            <wp:docPr id="25" name="Picture 25"/>
+            <wp:cNvGraphicFramePr>
+              <a:graphicFrameLocks xmlns:a="http://schemas.openxmlformats.org/drawingml/2006/main" noChangeAspect="1"/>
+            </wp:cNvGraphicFramePr>
+            <a:graphic xmlns:a="http://schemas.openxmlformats.org/drawingml/2006/main">
+              <a:graphicData uri="http://schemas.openxmlformats.org/drawingml/2006/picture">
+                <pic:pic xmlns:pic="http://schemas.openxmlformats.org/drawingml/2006/picture">
+                  <pic:nvPicPr>
+                    <pic:cNvPr id="0" name="46_selector_empresa.jpg"/>
+                    <pic:cNvPicPr/>
+                  </pic:nvPicPr>
+                  <pic:blipFill>
+                    <a:blip r:embed="rId32"/>
+                    <a:stretch>
+                      <a:fillRect/>
+                    </a:stretch>
+                  </pic:blipFill>
+                  <pic:spPr>
+                    <a:xfrm>
+                      <a:off x="0" y="0"/>
+                      <a:ext cx="5580000" cy="2483954"/>
+                    </a:xfrm>
+                    <a:prstGeom prst="rect">
+                      <a:avLst/>
+                    </a:prstGeom>
+                  </pic:spPr>
+                </pic:pic>
+              </a:graphicData>
+            </a:graphic>
+          </wp:inline>
+        </w:drawing>
+      </w:r>
+    </w:p>
+    <w:p>
+      <w:pPr>
+        <w:jc w:val="center"/>
+      </w:pPr>
+      <w:r>
+        <w:rPr>
+          <w:i/>
+          <w:color w:val="595959"/>
+          <w:sz w:val="18"/>
+        </w:rPr>
+        <w:t>Selector de empresa del superusuario</w:t>
+      </w:r>
+    </w:p>
+    <w:p>
+      <w:pPr>
+        <w:jc w:val="center"/>
+      </w:pPr>
+      <w:r>
+        <w:rPr>
+          <w:noProof/>
+        </w:rPr>
+        <w:drawing>
+          <wp:inline distT="0" distB="0" distL="0" distR="0" wp14:anchorId="77AEE755" wp14:editId="0BEDB293">
+            <wp:extent cx="5580000" cy="2483954"/>
+            <wp:effectExtent l="0" t="0" r="0" b="0"/>
+            <wp:docPr id="26" name="Picture 26"/>
+            <wp:cNvGraphicFramePr>
+              <a:graphicFrameLocks xmlns:a="http://schemas.openxmlformats.org/drawingml/2006/main" noChangeAspect="1"/>
+            </wp:cNvGraphicFramePr>
+            <a:graphic xmlns:a="http://schemas.openxmlformats.org/drawingml/2006/main">
+              <a:graphicData uri="http://schemas.openxmlformats.org/drawingml/2006/picture">
+                <pic:pic xmlns:pic="http://schemas.openxmlformats.org/drawingml/2006/picture">
+                  <pic:nvPicPr>
+                    <pic:cNvPr id="0" name="50_admin_perfiles.jpg"/>
+                    <pic:cNvPicPr/>
+                  </pic:nvPicPr>
+                  <pic:blipFill>
+                    <a:blip r:embed="rId33"/>
+                    <a:stretch>
+                      <a:fillRect/>
+                    </a:stretch>
+                  </pic:blipFill>
+                  <pic:spPr>
+                    <a:xfrm>
+                      <a:off x="0" y="0"/>
+                      <a:ext cx="5580000" cy="2483954"/>
+                    </a:xfrm>
+                    <a:prstGeom prst="rect">
+                      <a:avLst/>
+                    </a:prstGeom>
+                  </pic:spPr>
+                </pic:pic>
+              </a:graphicData>
+            </a:graphic>
+          </wp:inline>
+        </w:drawing>
+      </w:r>
+    </w:p>
+    <w:p>
+      <w:pPr>
+        <w:jc w:val="center"/>
+      </w:pPr>
+      <w:r>
+        <w:rPr>
+          <w:i/>
+          <w:color w:val="595959"/>
+          <w:sz w:val="18"/>
+        </w:rPr>
+        <w:t>Perfiles de usuario en el administrador</w:t>
+      </w:r>
+    </w:p>
+    <w:p>
+      <w:pPr>
+        <w:jc w:val="center"/>
+      </w:pPr>
+      <w:r>
+        <w:rPr>
+          <w:noProof/>
+        </w:rPr>
+        <w:drawing>
+          <wp:inline distT="0" distB="0" distL="0" distR="0" wp14:anchorId="38E86D45" wp14:editId="47B4CEED">
+            <wp:extent cx="5580000" cy="2483954"/>
+            <wp:effectExtent l="0" t="0" r="0" b="0"/>
+            <wp:docPr id="27" name="Picture 27"/>
+            <wp:cNvGraphicFramePr>
+              <a:graphicFrameLocks xmlns:a="http://schemas.openxmlformats.org/drawingml/2006/main" noChangeAspect="1"/>
+            </wp:cNvGraphicFramePr>
+            <a:graphic xmlns:a="http://schemas.openxmlformats.org/drawingml/2006/main">
+              <a:graphicData uri="http://schemas.openxmlformats.org/drawingml/2006/picture">
+                <pic:pic xmlns:pic="http://schemas.openxmlformats.org/drawingml/2006/picture">
+                  <pic:nvPicPr>
+                    <pic:cNvPr id="0" name="51_admin_grupo.jpg"/>
+                    <pic:cNvPicPr/>
+                  </pic:nvPicPr>
+                  <pic:blipFill>
+                    <a:blip r:embed="rId34"/>
+                    <a:stretch>
+                      <a:fillRect/>
+                    </a:stretch>
+                  </pic:blipFill>
+                  <pic:spPr>
+                    <a:xfrm>
+                      <a:off x="0" y="0"/>
+                      <a:ext cx="5580000" cy="2483954"/>
+                    </a:xfrm>
+                    <a:prstGeom prst="rect">
+                      <a:avLst/>
+                    </a:prstGeom>
+                  </pic:spPr>
+                </pic:pic>
+              </a:graphicData>
+            </a:graphic>
+          </wp:inline>
+        </w:drawing>
+      </w:r>
+    </w:p>
+    <w:p>
+      <w:pPr>
+        <w:jc w:val="center"/>
+      </w:pPr>
+      <w:r>
+        <w:rPr>
+          <w:i/>
+          <w:color w:val="595959"/>
+          <w:sz w:val="18"/>
+        </w:rPr>
+        <w:t>Usuarios de un grupo (rol)</w:t>
+      </w:r>
+    </w:p>
+    <w:p>
+      <w:pPr>
         <w:pStyle w:val="Ttulo2"/>
       </w:pPr>
-      <w:bookmarkStart w:id="21" w:name="_Toc243776943"/>
+      <w:bookmarkStart w:id="21" w:name="_Toc243779774"/>
       <w:r>
         <w:t>4. Preguntas frecuentes</w:t>
       </w:r>
@@ -10574,7 +12243,7 @@
       <w:pPr>
         <w:pStyle w:val="Ttulo1"/>
       </w:pPr>
-      <w:bookmarkStart w:id="22" w:name="_Toc243776944"/>
+      <w:bookmarkStart w:id="22" w:name="_Toc243779775"/>
       <w:r>
         <w:t>Manual técnico</w:t>
       </w:r>
@@ -10593,7 +12262,7 @@
       <w:pPr>
         <w:pStyle w:val="Ttulo2"/>
       </w:pPr>
-      <w:bookmarkStart w:id="23" w:name="_Toc243776945"/>
+      <w:bookmarkStart w:id="23" w:name="_Toc243779776"/>
       <w:r>
         <w:t>1. Arquitectura</w:t>
       </w:r>
@@ -10689,7 +12358,7 @@
       <w:pPr>
         <w:pStyle w:val="Ttulo3"/>
       </w:pPr>
-      <w:bookmarkStart w:id="24" w:name="_Toc243776946"/>
+      <w:bookmarkStart w:id="24" w:name="_Toc243779777"/>
       <w:r>
         <w:t>Apps</w:t>
       </w:r>
@@ -11205,7 +12874,7 @@
       <w:pPr>
         <w:pStyle w:val="Ttulo3"/>
       </w:pPr>
-      <w:bookmarkStart w:id="25" w:name="_Toc243776947"/>
+      <w:bookmarkStart w:id="25" w:name="_Toc243779778"/>
       <w:r>
         <w:t>Dependencias de importación entre apps</w:t>
       </w:r>
@@ -11294,7 +12963,7 @@
       <w:pPr>
         <w:pStyle w:val="Ttulo3"/>
       </w:pPr>
-      <w:bookmarkStart w:id="26" w:name="_Toc243776948"/>
+      <w:bookmarkStart w:id="26" w:name="_Toc243779779"/>
       <w:r>
         <w:t>Layout y estáticos</w:t>
       </w:r>
@@ -11421,7 +13090,7 @@
       <w:pPr>
         <w:pStyle w:val="Ttulo2"/>
       </w:pPr>
-      <w:bookmarkStart w:id="27" w:name="_Toc243776949"/>
+      <w:bookmarkStart w:id="27" w:name="_Toc243779780"/>
       <w:r>
         <w:t>2. Modelo de datos</w:t>
       </w:r>
@@ -11520,7 +13189,7 @@
       <w:pPr>
         <w:pStyle w:val="Ttulo3"/>
       </w:pPr>
-      <w:bookmarkStart w:id="28" w:name="_Toc243776950"/>
+      <w:bookmarkStart w:id="28" w:name="_Toc243779781"/>
       <w:r>
         <w:t>usuarios</w:t>
       </w:r>
@@ -11870,7 +13539,7 @@
       <w:pPr>
         <w:pStyle w:val="Ttulo3"/>
       </w:pPr>
-      <w:bookmarkStart w:id="29" w:name="_Toc243776951"/>
+      <w:bookmarkStart w:id="29" w:name="_Toc243779782"/>
       <w:r>
         <w:t>categorias</w:t>
       </w:r>
@@ -11975,7 +13644,7 @@
       <w:pPr>
         <w:pStyle w:val="Ttulo3"/>
       </w:pPr>
-      <w:bookmarkStart w:id="30" w:name="_Toc243776952"/>
+      <w:bookmarkStart w:id="30" w:name="_Toc243779783"/>
       <w:r>
         <w:t>productos</w:t>
       </w:r>
@@ -12651,7 +14320,7 @@
       <w:pPr>
         <w:pStyle w:val="Ttulo3"/>
       </w:pPr>
-      <w:bookmarkStart w:id="31" w:name="_Toc243776953"/>
+      <w:bookmarkStart w:id="31" w:name="_Toc243779784"/>
       <w:r>
         <w:t>inventario</w:t>
       </w:r>
@@ -12988,7 +14657,7 @@
       <w:pPr>
         <w:pStyle w:val="Ttulo3"/>
       </w:pPr>
-      <w:bookmarkStart w:id="32" w:name="_Toc243776954"/>
+      <w:bookmarkStart w:id="32" w:name="_Toc243779785"/>
       <w:r>
         <w:t>Migraciones</w:t>
       </w:r>
@@ -13083,7 +14752,7 @@
       <w:pPr>
         <w:pStyle w:val="Ttulo2"/>
       </w:pPr>
-      <w:bookmarkStart w:id="33" w:name="_Toc243776955"/>
+      <w:bookmarkStart w:id="33" w:name="_Toc243779786"/>
       <w:r>
         <w:t>3. Reglas de negocio e integridad</w:t>
       </w:r>
@@ -13093,7 +14762,7 @@
       <w:pPr>
         <w:pStyle w:val="Ttulo3"/>
       </w:pPr>
-      <w:bookmarkStart w:id="34" w:name="_Toc243776956"/>
+      <w:bookmarkStart w:id="34" w:name="_Toc243779787"/>
       <w:r>
         <w:t>3.1 Movimientos (</w:t>
       </w:r>
@@ -13272,7 +14941,7 @@
       <w:pPr>
         <w:pStyle w:val="Ttulo3"/>
       </w:pPr>
-      <w:bookmarkStart w:id="35" w:name="_Toc243776957"/>
+      <w:bookmarkStart w:id="35" w:name="_Toc243779788"/>
       <w:r>
         <w:t>3.2 Traslados (</w:t>
       </w:r>
@@ -13491,7 +15160,7 @@
       <w:pPr>
         <w:pStyle w:val="Ttulo3"/>
       </w:pPr>
-      <w:bookmarkStart w:id="36" w:name="_Toc243776958"/>
+      <w:bookmarkStart w:id="36" w:name="_Toc243779789"/>
       <w:r>
         <w:t>3.3 Aislamiento multi-empresa</w:t>
       </w:r>
@@ -13602,7 +15271,7 @@
       <w:pPr>
         <w:pStyle w:val="Ttulo3"/>
       </w:pPr>
-      <w:bookmarkStart w:id="37" w:name="_Toc243776959"/>
+      <w:bookmarkStart w:id="37" w:name="_Toc243779790"/>
       <w:r>
         <w:t>3.4 Permisos</w:t>
       </w:r>
@@ -14257,7 +15926,7 @@
       <w:pPr>
         <w:pStyle w:val="Ttulo2"/>
       </w:pPr>
-      <w:bookmarkStart w:id="38" w:name="_Toc243776960"/>
+      <w:bookmarkStart w:id="38" w:name="_Toc243779791"/>
       <w:r>
         <w:t>4. Rutas</w:t>
       </w:r>
@@ -16914,7 +18583,7 @@
       <w:pPr>
         <w:pStyle w:val="Ttulo2"/>
       </w:pPr>
-      <w:bookmarkStart w:id="39" w:name="_Toc243776961"/>
+      <w:bookmarkStart w:id="39" w:name="_Toc243779792"/>
       <w:r>
         <w:t>5. Configuración</w:t>
       </w:r>
@@ -17717,7 +19386,7 @@
       <w:pPr>
         <w:pStyle w:val="Ttulo2"/>
       </w:pPr>
-      <w:bookmarkStart w:id="40" w:name="_Toc243776962"/>
+      <w:bookmarkStart w:id="40" w:name="_Toc243779793"/>
       <w:r>
         <w:t>6. Entorno de desarrollo (Docker)</w:t>
       </w:r>
@@ -17923,7 +19592,7 @@
       <w:pPr>
         <w:pStyle w:val="Ttulo3"/>
       </w:pPr>
-      <w:bookmarkStart w:id="41" w:name="_Toc243776963"/>
+      <w:bookmarkStart w:id="41" w:name="_Toc243779794"/>
       <w:r>
         <w:t>Comandos de gestión propios</w:t>
       </w:r>
@@ -18124,7 +19793,7 @@
       <w:pPr>
         <w:pStyle w:val="Ttulo3"/>
       </w:pPr>
-      <w:bookmarkStart w:id="42" w:name="_Toc243776964"/>
+      <w:bookmarkStart w:id="42" w:name="_Toc243779795"/>
       <w:r>
         <w:t>Pruebas</w:t>
       </w:r>
@@ -18169,7 +19838,7 @@
       <w:pPr>
         <w:pStyle w:val="Ttulo2"/>
       </w:pPr>
-      <w:bookmarkStart w:id="43" w:name="_Toc243776965"/>
+      <w:bookmarkStart w:id="43" w:name="_Toc243779796"/>
       <w:r>
         <w:t>7. Producción (PythonAnywhere)</w:t>
       </w:r>
@@ -18457,7 +20126,7 @@
       <w:pPr>
         <w:pStyle w:val="Ttulo2"/>
       </w:pPr>
-      <w:bookmarkStart w:id="44" w:name="_Toc243776966"/>
+      <w:bookmarkStart w:id="44" w:name="_Toc243779797"/>
       <w:r>
         <w:t>8. Mantenimiento habitual</w:t>
       </w:r>
@@ -18848,7 +20517,7 @@
       <w:pPr>
         <w:pStyle w:val="Ttulo2"/>
       </w:pPr>
-      <w:bookmarkStart w:id="45" w:name="_Toc243776967"/>
+      <w:bookmarkStart w:id="45" w:name="_Toc243779798"/>
       <w:r>
         <w:t>9. Limitaciones conocidas y mejoras sugeridas</w:t>
       </w:r>
@@ -19100,106 +20769,201 @@
       </w:r>
     </w:p>
     <w:p>
-      <w:r>
-        <w:t>Mejoras sugeridas: pruebas unitarias e integración; anulación controlada de movimientos; restringir el origen de traslados a la sucursal del usuario; exportar reportes; logging; API REST (DRF) si se requiere integración con otros sistemas; respaldos automáticos.</w:t>
-      </w:r>
-    </w:p>
-    <w:p>
-      <w:pPr>
-        <w:pStyle w:val="Ttulo2"/>
-      </w:pPr>
-      <w:bookmarkStart w:id="46" w:name="_Toc243776968"/>
-      <w:r>
-        <w:t>10. Historial de cambios recientes</w:t>
-      </w:r>
-      <w:bookmarkEnd w:id="46"/>
-    </w:p>
-    <w:p>
-      <w:pPr>
-        <w:pStyle w:val="Listaconvietas"/>
-      </w:pPr>
+      <w:pPr>
+        <w:spacing w:after="40"/>
+        <w:ind w:left="425" w:hanging="340"/>
+      </w:pPr>
+      <w:r>
+        <w:t>11.</w:t>
+      </w:r>
+      <w:r>
+        <w:tab/>
+      </w:r>
       <w:r>
         <w:rPr>
           <w:b/>
         </w:rPr>
-        <w:t>18/10/2026</w:t>
-      </w:r>
-      <w:r>
-        <w:t xml:space="preserve">: contenerización con Docker, regeneración de migraciones, corrección de bugs de permisos e integridad de stock (transacciones + </w:t>
+        <w:t>Formulario de producto</w:t>
+      </w:r>
+      <w:r>
+        <w:t>: la máscara del precio interpreta dígitos sueltos como centavos (</w:t>
       </w:r>
       <w:r>
         <w:rPr>
           <w:rFonts w:ascii="Consolas" w:eastAsia="Consolas" w:hAnsi="Consolas"/>
           <w:color w:val="C0392B"/>
         </w:rPr>
-        <w:t>select_for_update</w:t>
-      </w:r>
-      <w:r>
-        <w:t>), actualización de Django 3.2.25 → 4.2.30, variables de entorno.</w:t>
-      </w:r>
-    </w:p>
-    <w:p>
-      <w:pPr>
-        <w:pStyle w:val="Listaconvietas"/>
-      </w:pPr>
-      <w:r>
-        <w:rPr>
-          <w:b/>
-        </w:rPr>
-        <w:t>24/10/2026</w:t>
-      </w:r>
-      <w:r>
-        <w:t xml:space="preserve">: documentación completa (docstrings, README, manuales), comando </w:t>
+        <w:t>450</w:t>
+      </w:r>
+      <w:r>
+        <w:t xml:space="preserve"> → </w:t>
       </w:r>
       <w:r>
         <w:rPr>
           <w:rFonts w:ascii="Consolas" w:eastAsia="Consolas" w:hAnsi="Consolas"/>
           <w:color w:val="C0392B"/>
         </w:rPr>
-        <w:t>populate_demo</w:t>
-      </w:r>
-      <w:r>
-        <w:t xml:space="preserve">, correcciones menores: tipo de sucursal en el formulario de sucursales, cantidad en la tabla de traslados pendientes, encabezado faltante en traslados recientes, dashboard limitado a 10 movimientos, formulario de movimientos usa la empresa activa (superusuario), movimientos por empresa/sucursal restringidos a Supervisor (como el menú), botón editar oculto para Auditor en la lista de productos, carga masiva tolera celdas vacías y solo acepta </w:t>
+        <w:t>4.50</w:t>
+      </w:r>
+      <w:r>
+        <w:t xml:space="preserve">); el código elimina caracteres distintos de letras, números y guion; la validación del dígito verificador EAN-13 es solo visual (el servidor no la exige). Los códigos con </w:t>
       </w:r>
       <w:r>
         <w:rPr>
           <w:rFonts w:ascii="Consolas" w:eastAsia="Consolas" w:hAnsi="Consolas"/>
           <w:color w:val="C0392B"/>
         </w:rPr>
-        <w:t>.xlsx</w:t>
-      </w:r>
-      <w:r>
-        <w:t>; eliminados archivos huérfanos (</w:t>
+        <w:t>_</w:t>
+      </w:r>
+      <w:r>
+        <w:t xml:space="preserve"> de los datos de prueba no pueden crearse desde la pantalla.</w:t>
+      </w:r>
+    </w:p>
+    <w:p>
+      <w:r>
+        <w:t>Mejoras sugeridas: pruebas unitarias e integración; anulación controlada de movimientos; restringir el origen de traslados a la sucursal del usuario; exportar reportes; logging; API REST (DRF) si se requiere integración con otros sistemas; respaldos automáticos.</w:t>
+      </w:r>
+    </w:p>
+    <w:p>
+      <w:pPr>
+        <w:pStyle w:val="Ttulo2"/>
+      </w:pPr>
+      <w:bookmarkStart w:id="46" w:name="_Toc243779799"/>
+      <w:r>
+        <w:t>10. Historial de cambios recientes</w:t>
+      </w:r>
+      <w:bookmarkEnd w:id="46"/>
+    </w:p>
+    <w:p>
+      <w:pPr>
+        <w:pStyle w:val="Listaconvietas"/>
+      </w:pPr>
+      <w:r>
+        <w:rPr>
+          <w:b/>
+        </w:rPr>
+        <w:t>18/10/2026</w:t>
+      </w:r>
+      <w:r>
+        <w:t xml:space="preserve">: contenerización con Docker, regeneración de migraciones, corrección de bugs de permisos e integridad de stock (transacciones + </w:t>
       </w:r>
       <w:r>
         <w:rPr>
           <w:rFonts w:ascii="Consolas" w:eastAsia="Consolas" w:hAnsi="Consolas"/>
           <w:color w:val="C0392B"/>
         </w:rPr>
-        <w:t>populate_pythonanywhere.py</w:t>
-      </w:r>
-      <w:r>
-        <w:t xml:space="preserve">, </w:t>
+        <w:t>select_for_update</w:t>
+      </w:r>
+      <w:r>
+        <w:t>), actualización de Django 3.2.25 → 4.2.30, variables de entorno.</w:t>
+      </w:r>
+    </w:p>
+    <w:p>
+      <w:pPr>
+        <w:pStyle w:val="Listaconvietas"/>
+      </w:pPr>
+      <w:r>
+        <w:rPr>
+          <w:b/>
+        </w:rPr>
+        <w:t>24/10/2026</w:t>
+      </w:r>
+      <w:r>
+        <w:t xml:space="preserve">: documentación completa (docstrings, README, manuales), comando </w:t>
       </w:r>
       <w:r>
         <w:rPr>
           <w:rFonts w:ascii="Consolas" w:eastAsia="Consolas" w:hAnsi="Consolas"/>
           <w:color w:val="C0392B"/>
         </w:rPr>
-        <w:t>productos_sucursal.html</w:t>
-      </w:r>
-      <w:r>
-        <w:t xml:space="preserve">, </w:t>
+        <w:t>populate_demo</w:t>
+      </w:r>
+      <w:r>
+        <w:t xml:space="preserve">, correcciones menores: tipo de sucursal en el formulario de sucursales, cantidad en la tabla de traslados pendientes, encabezado faltante en traslados recientes, dashboard limitado a 10 movimientos, formulario de movimientos usa la empresa activa (superusuario), movimientos por empresa/sucursal restringidos a Supervisor (como el menú), botón editar oculto para Auditor en la lista de productos, carga masiva tolera celdas vacías y solo acepta </w:t>
       </w:r>
       <w:r>
         <w:rPr>
           <w:rFonts w:ascii="Consolas" w:eastAsia="Consolas" w:hAnsi="Consolas"/>
           <w:color w:val="C0392B"/>
         </w:rPr>
+        <w:t>.xlsx</w:t>
+      </w:r>
+      <w:r>
+        <w:t>; eliminados archivos huérfanos (</w:t>
+      </w:r>
+      <w:r>
+        <w:rPr>
+          <w:rFonts w:ascii="Consolas" w:eastAsia="Consolas" w:hAnsi="Consolas"/>
+          <w:color w:val="C0392B"/>
+        </w:rPr>
+        <w:t>populate_pythonanywhere.py</w:t>
+      </w:r>
+      <w:r>
+        <w:t xml:space="preserve">, </w:t>
+      </w:r>
+      <w:r>
+        <w:rPr>
+          <w:rFonts w:ascii="Consolas" w:eastAsia="Consolas" w:hAnsi="Consolas"/>
+          <w:color w:val="C0392B"/>
+        </w:rPr>
+        <w:t>productos_sucursal.html</w:t>
+      </w:r>
+      <w:r>
+        <w:t xml:space="preserve">, </w:t>
+      </w:r>
+      <w:r>
+        <w:rPr>
+          <w:rFonts w:ascii="Consolas" w:eastAsia="Consolas" w:hAnsi="Consolas"/>
+          <w:color w:val="C0392B"/>
+        </w:rPr>
         <w:t>inventario/signals.py</w:t>
       </w:r>
       <w:r>
         <w:t>).</w:t>
+      </w:r>
+    </w:p>
+    <w:p>
+      <w:pPr>
+        <w:pStyle w:val="Listaconvietas"/>
+      </w:pPr>
+      <w:r>
+        <w:rPr>
+          <w:b/>
+        </w:rPr>
+        <w:t>25/10/2026</w:t>
+      </w:r>
+      <w:r>
+        <w:t>: recorrido completo en Chrome con capturas (</w:t>
+      </w:r>
+      <w:r>
+        <w:rPr>
+          <w:rFonts w:ascii="Consolas" w:eastAsia="Consolas" w:hAnsi="Consolas"/>
+          <w:color w:val="C0392B"/>
+        </w:rPr>
+        <w:t>docs/capturas/</w:t>
+      </w:r>
+      <w:r>
+        <w:t>) y videos (</w:t>
+      </w:r>
+      <w:r>
+        <w:rPr>
+          <w:rFonts w:ascii="Consolas" w:eastAsia="Consolas" w:hAnsi="Consolas"/>
+          <w:color w:val="C0392B"/>
+        </w:rPr>
+        <w:t>docs/videos/</w:t>
+      </w:r>
+      <w:r>
+        <w:t xml:space="preserve">); documento Word/PDF con imágenes. Ajustes detectados en el recorrido: fila de producto inactivo legible, botón "Nuevo Producto" solo para Supervisor, el comentario del movimiento se conserva al reenviar el formulario, columna Déficit del reporte de alertas calculada en la vista y sin botón "Reabastecer" (no tenía función); </w:t>
+      </w:r>
+      <w:r>
+        <w:rPr>
+          <w:rFonts w:ascii="Consolas" w:eastAsia="Consolas" w:hAnsi="Consolas"/>
+          <w:color w:val="C0392B"/>
+        </w:rPr>
+        <w:t>populate_data</w:t>
+      </w:r>
+      <w:r>
+        <w:t xml:space="preserve"> asigna cada producto a la clase de su prefijo.</w:t>
       </w:r>
     </w:p>
     <w:p>
@@ -19221,7 +20985,7 @@
       <w:pPr>
         <w:pStyle w:val="Ttulo1"/>
       </w:pPr>
-      <w:bookmarkStart w:id="47" w:name="_Toc243776969"/>
+      <w:bookmarkStart w:id="47" w:name="_Toc243779800"/>
       <w:r>
         <w:t>Anexo: guion de demostración</w:t>
       </w:r>
@@ -19358,6 +21122,61 @@
       </w:r>
       <w:r>
         <w:t xml:space="preserve"> en Chrome (ventana de 1366×768 o mayor, zoom 100 %).</w:t>
+      </w:r>
+    </w:p>
+    <w:p>
+      <w:r>
+        <w:t xml:space="preserve">Material ya generado a partir de este guion (recorrido del 24/10/2026): capturas en </w:t>
+      </w:r>
+      <w:r>
+        <w:rPr>
+          <w:rFonts w:ascii="Consolas" w:eastAsia="Consolas" w:hAnsi="Consolas"/>
+          <w:color w:val="C0392B"/>
+        </w:rPr>
+        <w:t>docs/capturas/</w:t>
+      </w:r>
+      <w:r>
+        <w:t xml:space="preserve"> y videos por escena en </w:t>
+      </w:r>
+      <w:r>
+        <w:rPr>
+          <w:rFonts w:ascii="Consolas" w:eastAsia="Consolas" w:hAnsi="Consolas"/>
+          <w:color w:val="C0392B"/>
+        </w:rPr>
+        <w:t>docs/videos/</w:t>
+      </w:r>
+      <w:r>
+        <w:t xml:space="preserve"> (</w:t>
+      </w:r>
+      <w:r>
+        <w:rPr>
+          <w:rFonts w:ascii="Consolas" w:eastAsia="Consolas" w:hAnsi="Consolas"/>
+          <w:color w:val="C0392B"/>
+        </w:rPr>
+        <w:t>escena_N_*.gif</w:t>
+      </w:r>
+      <w:r>
+        <w:t xml:space="preserve"> y </w:t>
+      </w:r>
+      <w:r>
+        <w:rPr>
+          <w:rFonts w:ascii="Consolas" w:eastAsia="Consolas" w:hAnsi="Consolas"/>
+          <w:color w:val="C0392B"/>
+        </w:rPr>
+        <w:t>recorrido_completo.mp4</w:t>
+      </w:r>
+      <w:r>
+        <w:t xml:space="preserve">, regenerables con </w:t>
+      </w:r>
+      <w:r>
+        <w:rPr>
+          <w:rFonts w:ascii="Consolas" w:eastAsia="Consolas" w:hAnsi="Consolas"/>
+          <w:color w:val="C0392B"/>
+        </w:rPr>
+        <w:t>python docs/generar_videos.py</w:t>
+      </w:r>
+      <w:r>
+        <w:t>). Sirven de base para grabar la narración.</w:t>
       </w:r>
     </w:p>
     <w:p>
@@ -19379,7 +21198,7 @@
       <w:pPr>
         <w:pStyle w:val="Ttulo2"/>
       </w:pPr>
-      <w:bookmarkStart w:id="48" w:name="_Toc243776970"/>
+      <w:bookmarkStart w:id="48" w:name="_Toc243779801"/>
       <w:r>
         <w:t xml:space="preserve">Escena 1 — Administración (usuario </w:t>
       </w:r>
@@ -19693,7 +21512,7 @@
       <w:pPr>
         <w:pStyle w:val="Ttulo2"/>
       </w:pPr>
-      <w:bookmarkStart w:id="49" w:name="_Toc243776971"/>
+      <w:bookmarkStart w:id="49" w:name="_Toc243779802"/>
       <w:r>
         <w:t xml:space="preserve">Escena 2 — Supervisor de la bodega (usuario </w:t>
       </w:r>
@@ -19800,50 +21619,80 @@
           <w:rFonts w:ascii="Consolas" w:eastAsia="Consolas" w:hAnsi="Consolas"/>
           <w:color w:val="C0392B"/>
         </w:rPr>
-        <w:t>TEC_TAB002</w:t>
-      </w:r>
-      <w:r>
-        <w:t xml:space="preserve">, código EAN </w:t>
+        <w:t>TEC-TAB002</w:t>
+      </w:r>
+      <w:r>
+        <w:t xml:space="preserve"> (el campo no admite </w:t>
       </w:r>
       <w:r>
         <w:rPr>
           <w:rFonts w:ascii="Consolas" w:eastAsia="Consolas" w:hAnsi="Consolas"/>
           <w:color w:val="C0392B"/>
         </w:rPr>
-        <w:t>7861234567890</w:t>
-      </w:r>
-      <w:r>
-        <w:t xml:space="preserve">, modelo </w:t>
+        <w:t>_</w:t>
+      </w:r>
+      <w:r>
+        <w:t xml:space="preserve">), código EAN </w:t>
       </w:r>
       <w:r>
         <w:rPr>
           <w:rFonts w:ascii="Consolas" w:eastAsia="Consolas" w:hAnsi="Consolas"/>
           <w:color w:val="C0392B"/>
         </w:rPr>
-        <w:t>GALAXY-TAB-S9</w:t>
-      </w:r>
-      <w:r>
-        <w:t xml:space="preserve"> (mostrar el autocompletado de modelos), nombre </w:t>
+        <w:t>7861234567898</w:t>
+      </w:r>
+      <w:r>
+        <w:t xml:space="preserve"> (dígito verificador válido), modelo </w:t>
       </w:r>
       <w:r>
         <w:rPr>
           <w:rFonts w:ascii="Consolas" w:eastAsia="Consolas" w:hAnsi="Consolas"/>
           <w:color w:val="C0392B"/>
         </w:rPr>
-        <w:t>Tablet Samsung Galaxy Tab S9</w:t>
-      </w:r>
-      <w:r>
-        <w:t xml:space="preserve">, precio </w:t>
+        <w:t>GALAXY-TAB-S9</w:t>
+      </w:r>
+      <w:r>
+        <w:t xml:space="preserve"> (mostrar el autocompletado de modelos), nombre </w:t>
       </w:r>
       <w:r>
         <w:rPr>
           <w:rFonts w:ascii="Consolas" w:eastAsia="Consolas" w:hAnsi="Consolas"/>
           <w:color w:val="C0392B"/>
         </w:rPr>
+        <w:t>Tablet Samsung Galaxy Tab S9</w:t>
+      </w:r>
+      <w:r>
+        <w:t xml:space="preserve">, precio </w:t>
+      </w:r>
+      <w:r>
+        <w:rPr>
+          <w:rFonts w:ascii="Consolas" w:eastAsia="Consolas" w:hAnsi="Consolas"/>
+          <w:color w:val="C0392B"/>
+        </w:rPr>
+        <w:t>450.00</w:t>
+      </w:r>
+      <w:r>
+        <w:t xml:space="preserve"> (escribir los decimales: si se teclea solo </w:t>
+      </w:r>
+      <w:r>
+        <w:rPr>
+          <w:rFonts w:ascii="Consolas" w:eastAsia="Consolas" w:hAnsi="Consolas"/>
+          <w:color w:val="C0392B"/>
+        </w:rPr>
         <w:t>450</w:t>
       </w:r>
       <w:r>
-        <w:t>.</w:t>
+        <w:t xml:space="preserve"> el campo lo interpreta como </w:t>
+      </w:r>
+      <w:r>
+        <w:rPr>
+          <w:rFonts w:ascii="Consolas" w:eastAsia="Consolas" w:hAnsi="Consolas"/>
+          <w:color w:val="C0392B"/>
+        </w:rPr>
+        <w:t>4.50</w:t>
+      </w:r>
+      <w:r>
+        <w:t>).</w:t>
       </w:r>
     </w:p>
     <w:p>
@@ -19909,7 +21758,7 @@
           <w:rFonts w:ascii="Consolas" w:eastAsia="Consolas" w:hAnsi="Consolas"/>
           <w:color w:val="C0392B"/>
         </w:rPr>
-        <w:t>TEC_TAB002</w:t>
+        <w:t>TEC-TAB002</w:t>
       </w:r>
       <w:r>
         <w:t xml:space="preserve">, cantidad 20, comentario </w:t>
@@ -20001,7 +21850,7 @@
           <w:rFonts w:ascii="Consolas" w:eastAsia="Consolas" w:hAnsi="Consolas"/>
           <w:color w:val="C0392B"/>
         </w:rPr>
-        <w:t>TEC_TAB002</w:t>
+        <w:t>TEC-TAB002</w:t>
       </w:r>
       <w:r>
         <w:t xml:space="preserve">, cantidad 5, Guía de Remisión </w:t>
@@ -20122,7 +21971,7 @@
       <w:pPr>
         <w:pStyle w:val="Ttulo2"/>
       </w:pPr>
-      <w:bookmarkStart w:id="50" w:name="_Toc243776972"/>
+      <w:bookmarkStart w:id="50" w:name="_Toc243779803"/>
       <w:r>
         <w:t xml:space="preserve">Escena 3 — Encargado de la sucursal (usuario </w:t>
       </w:r>
@@ -20201,6 +22050,8 @@
       </w:r>
       <w:r>
         <w:tab/>
+      </w:r>
+      <w:r>
         <w:t xml:space="preserve">Menú reducido: solo Productos (búsqueda) y Mantenimiento Inventario. Intentar entrar a </w:t>
       </w:r>
       <w:r>
@@ -20330,7 +22181,7 @@
           <w:rFonts w:ascii="Consolas" w:eastAsia="Consolas" w:hAnsi="Consolas"/>
           <w:color w:val="C0392B"/>
         </w:rPr>
-        <w:t>TEC_TAB002</w:t>
+        <w:t>TEC-TAB002</w:t>
       </w:r>
       <w:r>
         <w:t xml:space="preserve">, Nota de Venta </w:t>
@@ -20412,7 +22263,7 @@
           <w:rFonts w:ascii="Consolas" w:eastAsia="Consolas" w:hAnsi="Consolas"/>
           <w:color w:val="C0392B"/>
         </w:rPr>
-        <w:t>TEC_TAB002</w:t>
+        <w:t>TEC-TAB002</w:t>
       </w:r>
       <w:r>
         <w:t xml:space="preserve"> → se ven la entrada en Matriz, el traslado confirmado y la salida en Guayaquil; stock total 19.</w:t>
@@ -20435,7 +22286,7 @@
       <w:pPr>
         <w:pStyle w:val="Ttulo2"/>
       </w:pPr>
-      <w:bookmarkStart w:id="51" w:name="_Toc243776973"/>
+      <w:bookmarkStart w:id="51" w:name="_Toc243779804"/>
       <w:r>
         <w:t xml:space="preserve">Escena 4 — Auditoría (usuario </w:t>
       </w:r>
@@ -20574,7 +22425,7 @@
       <w:pPr>
         <w:pStyle w:val="Ttulo2"/>
       </w:pPr>
-      <w:bookmarkStart w:id="52" w:name="_Toc243776974"/>
+      <w:bookmarkStart w:id="52" w:name="_Toc243779805"/>
       <w:r>
         <w:t xml:space="preserve">Escena 5 — Superusuario y administración de usuarios (usuario </w:t>
       </w:r>
@@ -20746,6 +22597,8 @@
       </w:r>
       <w:r>
         <w:tab/>
+      </w:r>
+      <w:r>
         <w:t xml:space="preserve">(Opcional) Login como </w:t>
       </w:r>
       <w:r>
@@ -20763,7 +22616,7 @@
       <w:pPr>
         <w:pStyle w:val="Ttulo2"/>
       </w:pPr>
-      <w:bookmarkStart w:id="53" w:name="_Toc243776975"/>
+      <w:bookmarkStart w:id="53" w:name="_Toc243779806"/>
       <w:r>
         <w:t>Cierre</w:t>
       </w:r>
@@ -20834,12 +22687,12 @@
       </w:r>
     </w:p>
     <w:sectPr>
-      <w:headerReference w:type="even" r:id="rId8"/>
-      <w:headerReference w:type="default" r:id="rId9"/>
-      <w:footerReference w:type="even" r:id="rId10"/>
-      <w:footerReference w:type="default" r:id="rId11"/>
-      <w:headerReference w:type="first" r:id="rId12"/>
-      <w:footerReference w:type="first" r:id="rId13"/>
+      <w:headerReference w:type="even" r:id="rId35"/>
+      <w:headerReference w:type="default" r:id="rId36"/>
+      <w:footerReference w:type="even" r:id="rId37"/>
+      <w:footerReference w:type="default" r:id="rId38"/>
+      <w:headerReference w:type="first" r:id="rId39"/>
+      <w:footerReference w:type="first" r:id="rId40"/>
       <w:pgSz w:w="11906" w:h="16838"/>
       <w:pgMar w:top="1134" w:right="1247" w:bottom="1020" w:left="1247" w:header="720" w:footer="720" w:gutter="0"/>
       <w:cols w:space="720"/>
@@ -21184,31 +23037,31 @@
       </w:rPr>
     </w:lvl>
   </w:abstractNum>
-  <w:num w:numId="1" w16cid:durableId="396980207">
+  <w:num w:numId="1" w16cid:durableId="587740178">
     <w:abstractNumId w:val="8"/>
   </w:num>
-  <w:num w:numId="2" w16cid:durableId="464659652">
+  <w:num w:numId="2" w16cid:durableId="291910776">
     <w:abstractNumId w:val="6"/>
   </w:num>
-  <w:num w:numId="3" w16cid:durableId="502168437">
+  <w:num w:numId="3" w16cid:durableId="981467645">
     <w:abstractNumId w:val="5"/>
   </w:num>
-  <w:num w:numId="4" w16cid:durableId="1477651568">
+  <w:num w:numId="4" w16cid:durableId="494418887">
     <w:abstractNumId w:val="4"/>
   </w:num>
-  <w:num w:numId="5" w16cid:durableId="1285428353">
+  <w:num w:numId="5" w16cid:durableId="59638143">
     <w:abstractNumId w:val="7"/>
   </w:num>
-  <w:num w:numId="6" w16cid:durableId="407386501">
+  <w:num w:numId="6" w16cid:durableId="1077049913">
     <w:abstractNumId w:val="3"/>
   </w:num>
-  <w:num w:numId="7" w16cid:durableId="1015576401">
+  <w:num w:numId="7" w16cid:durableId="701975483">
     <w:abstractNumId w:val="2"/>
   </w:num>
-  <w:num w:numId="8" w16cid:durableId="1719890823">
+  <w:num w:numId="8" w16cid:durableId="1122116262">
     <w:abstractNumId w:val="1"/>
   </w:num>
-  <w:num w:numId="9" w16cid:durableId="367878423">
+  <w:num w:numId="9" w16cid:durableId="655450817">
     <w:abstractNumId w:val="0"/>
   </w:num>
 </w:numbering>
@@ -32607,7 +34460,7 @@
     <w:autoRedefine/>
     <w:uiPriority w:val="39"/>
     <w:unhideWhenUsed/>
-    <w:rsid w:val="007111E7"/>
+    <w:rsid w:val="008E481B"/>
     <w:pPr>
       <w:spacing w:after="100"/>
     </w:pPr>
@@ -32619,7 +34472,7 @@
     <w:autoRedefine/>
     <w:uiPriority w:val="39"/>
     <w:unhideWhenUsed/>
-    <w:rsid w:val="007111E7"/>
+    <w:rsid w:val="008E481B"/>
     <w:pPr>
       <w:spacing w:after="100"/>
       <w:ind w:left="210"/>
@@ -32632,7 +34485,7 @@
     <w:autoRedefine/>
     <w:uiPriority w:val="39"/>
     <w:unhideWhenUsed/>
-    <w:rsid w:val="007111E7"/>
+    <w:rsid w:val="008E481B"/>
     <w:pPr>
       <w:spacing w:after="100"/>
       <w:ind w:left="420"/>
@@ -32643,7 +34496,7 @@
     <w:basedOn w:val="Fuentedeprrafopredeter"/>
     <w:uiPriority w:val="99"/>
     <w:unhideWhenUsed/>
-    <w:rsid w:val="007111E7"/>
+    <w:rsid w:val="008E481B"/>
     <w:rPr>
       <w:color w:val="0000FF" w:themeColor="hyperlink"/>
       <w:u w:val="single"/>

</xml_diff>